<commit_message>
Sindhu Solar Consumption Data uploaded with Embeddings
</commit_message>
<xml_diff>
--- a/sql/SQL Scripts for Renewable Energy Project.docx
+++ b/sql/SQL Scripts for Renewable Energy Project.docx
@@ -55,7 +55,14 @@
         <w:rPr>
           <w:rFonts w:ascii="Calibri" w:hAnsi="Calibri" w:cs="Calibri"/>
         </w:rPr>
-        <w:t>CREATE DATABASE energy</w:t>
+        <w:t xml:space="preserve">CREATE DATABASE </w:t>
+      </w:r>
+      <w:proofErr w:type="spellStart"/>
+      <w:r>
+        <w:rPr>
+          <w:rFonts w:ascii="Calibri" w:hAnsi="Calibri" w:cs="Calibri"/>
+        </w:rPr>
+        <w:t>energy</w:t>
       </w:r>
       <w:r>
         <w:rPr>
@@ -63,6 +70,7 @@
         </w:rPr>
         <w:t>DB</w:t>
       </w:r>
+      <w:proofErr w:type="spellEnd"/>
     </w:p>
     <w:p>
       <w:pPr>
@@ -89,8 +97,16 @@
         <w:rPr>
           <w:rFonts w:ascii="Calibri" w:hAnsi="Calibri" w:cs="Calibri"/>
         </w:rPr>
-        <w:t xml:space="preserve">    OWNER = postgres</w:t>
-      </w:r>
+        <w:t xml:space="preserve">    OWNER = </w:t>
+      </w:r>
+      <w:proofErr w:type="spellStart"/>
+      <w:r>
+        <w:rPr>
+          <w:rFonts w:ascii="Calibri" w:hAnsi="Calibri" w:cs="Calibri"/>
+        </w:rPr>
+        <w:t>postgres</w:t>
+      </w:r>
+      <w:proofErr w:type="spellEnd"/>
     </w:p>
     <w:p>
       <w:pPr>
@@ -117,7 +133,21 @@
         <w:rPr>
           <w:rFonts w:ascii="Calibri" w:hAnsi="Calibri" w:cs="Calibri"/>
         </w:rPr>
-        <w:t xml:space="preserve">    LOCALE_PROVIDER = 'libc'</w:t>
+        <w:t xml:space="preserve">    LOCALE_PROVIDER = '</w:t>
+      </w:r>
+      <w:proofErr w:type="spellStart"/>
+      <w:r>
+        <w:rPr>
+          <w:rFonts w:ascii="Calibri" w:hAnsi="Calibri" w:cs="Calibri"/>
+        </w:rPr>
+        <w:t>libc</w:t>
+      </w:r>
+      <w:proofErr w:type="spellEnd"/>
+      <w:r>
+        <w:rPr>
+          <w:rFonts w:ascii="Calibri" w:hAnsi="Calibri" w:cs="Calibri"/>
+        </w:rPr>
+        <w:t>'</w:t>
       </w:r>
     </w:p>
     <w:p>
@@ -223,34 +253,52 @@
         <w:pStyle w:val="NoSpacing"/>
       </w:pPr>
       <w:r>
-        <w:t>-- Table: public.isocodes</w:t>
-      </w:r>
-    </w:p>
-    <w:p>
-      <w:pPr>
-        <w:pStyle w:val="NoSpacing"/>
-      </w:pPr>
-    </w:p>
-    <w:p>
-      <w:pPr>
-        <w:pStyle w:val="NoSpacing"/>
-      </w:pPr>
-      <w:r>
-        <w:t>-- DROP TABLE IF EXISTS public.isocodes;</w:t>
-      </w:r>
-    </w:p>
-    <w:p>
-      <w:pPr>
-        <w:pStyle w:val="NoSpacing"/>
-      </w:pPr>
-    </w:p>
-    <w:p>
-      <w:pPr>
-        <w:pStyle w:val="NoSpacing"/>
-      </w:pPr>
-      <w:r>
-        <w:t>CREATE TABLE IF NOT EXISTS public.isocodes</w:t>
-      </w:r>
+        <w:t xml:space="preserve">-- Table: </w:t>
+      </w:r>
+      <w:proofErr w:type="spellStart"/>
+      <w:r>
+        <w:t>public.isocodes</w:t>
+      </w:r>
+      <w:proofErr w:type="spellEnd"/>
+    </w:p>
+    <w:p>
+      <w:pPr>
+        <w:pStyle w:val="NoSpacing"/>
+      </w:pPr>
+    </w:p>
+    <w:p>
+      <w:pPr>
+        <w:pStyle w:val="NoSpacing"/>
+      </w:pPr>
+      <w:r>
+        <w:t xml:space="preserve">-- DROP TABLE IF EXISTS </w:t>
+      </w:r>
+      <w:proofErr w:type="spellStart"/>
+      <w:r>
+        <w:t>public.isocodes</w:t>
+      </w:r>
+      <w:proofErr w:type="spellEnd"/>
+      <w:r>
+        <w:t>;</w:t>
+      </w:r>
+    </w:p>
+    <w:p>
+      <w:pPr>
+        <w:pStyle w:val="NoSpacing"/>
+      </w:pPr>
+    </w:p>
+    <w:p>
+      <w:pPr>
+        <w:pStyle w:val="NoSpacing"/>
+      </w:pPr>
+      <w:r>
+        <w:t xml:space="preserve">CREATE TABLE IF NOT EXISTS </w:t>
+      </w:r>
+      <w:proofErr w:type="spellStart"/>
+      <w:r>
+        <w:t>public.isocodes</w:t>
+      </w:r>
+      <w:proofErr w:type="spellEnd"/>
     </w:p>
     <w:p>
       <w:pPr>
@@ -265,31 +313,79 @@
         <w:pStyle w:val="NoSpacing"/>
       </w:pPr>
       <w:r>
-        <w:t xml:space="preserve">    country text COLLATE pg_catalog."default",</w:t>
-      </w:r>
-    </w:p>
-    <w:p>
-      <w:pPr>
-        <w:pStyle w:val="NoSpacing"/>
-      </w:pPr>
-      <w:r>
-        <w:t xml:space="preserve">    isocode character varying(3) COLLATE pg_catalog."default" NOT NULL,</w:t>
-      </w:r>
-    </w:p>
-    <w:p>
-      <w:pPr>
-        <w:pStyle w:val="NoSpacing"/>
-      </w:pPr>
-      <w:r>
-        <w:t xml:space="preserve">    "ISO3166-2" text COLLATE pg_catalog."default",</w:t>
-      </w:r>
-    </w:p>
-    <w:p>
-      <w:pPr>
-        <w:pStyle w:val="NoSpacing"/>
-      </w:pPr>
-      <w:r>
-        <w:t xml:space="preserve">    CONSTRAINT isocodes_pkey PRIMARY KEY (isocode)</w:t>
+        <w:t xml:space="preserve">    country text COLLATE </w:t>
+      </w:r>
+      <w:proofErr w:type="spellStart"/>
+      <w:r>
+        <w:t>pg_catalog."default</w:t>
+      </w:r>
+      <w:proofErr w:type="spellEnd"/>
+      <w:r>
+        <w:t>",</w:t>
+      </w:r>
+    </w:p>
+    <w:p>
+      <w:pPr>
+        <w:pStyle w:val="NoSpacing"/>
+      </w:pPr>
+      <w:r>
+        <w:t xml:space="preserve">    </w:t>
+      </w:r>
+      <w:proofErr w:type="spellStart"/>
+      <w:r>
+        <w:t>isocode</w:t>
+      </w:r>
+      <w:proofErr w:type="spellEnd"/>
+      <w:r>
+        <w:t xml:space="preserve"> character varying(3) COLLATE </w:t>
+      </w:r>
+      <w:proofErr w:type="spellStart"/>
+      <w:r>
+        <w:t>pg_catalog."default</w:t>
+      </w:r>
+      <w:proofErr w:type="spellEnd"/>
+      <w:r>
+        <w:t>" NOT NULL,</w:t>
+      </w:r>
+    </w:p>
+    <w:p>
+      <w:pPr>
+        <w:pStyle w:val="NoSpacing"/>
+      </w:pPr>
+      <w:r>
+        <w:t xml:space="preserve">    "ISO3166-2" text COLLATE </w:t>
+      </w:r>
+      <w:proofErr w:type="spellStart"/>
+      <w:r>
+        <w:t>pg_catalog."default</w:t>
+      </w:r>
+      <w:proofErr w:type="spellEnd"/>
+      <w:r>
+        <w:t>",</w:t>
+      </w:r>
+    </w:p>
+    <w:p>
+      <w:pPr>
+        <w:pStyle w:val="NoSpacing"/>
+      </w:pPr>
+      <w:r>
+        <w:t xml:space="preserve">    CONSTRAINT </w:t>
+      </w:r>
+      <w:proofErr w:type="spellStart"/>
+      <w:r>
+        <w:t>isocodes_pkey</w:t>
+      </w:r>
+      <w:proofErr w:type="spellEnd"/>
+      <w:r>
+        <w:t xml:space="preserve"> PRIMARY KEY (</w:t>
+      </w:r>
+      <w:proofErr w:type="spellStart"/>
+      <w:r>
+        <w:t>isocode</w:t>
+      </w:r>
+      <w:proofErr w:type="spellEnd"/>
+      <w:r>
+        <w:t>)</w:t>
       </w:r>
       <w:r>
         <w:t>,</w:t>
@@ -330,102 +426,153 @@
         <w:pStyle w:val="NoSpacing"/>
       </w:pPr>
       <w:r>
-        <w:t>TABLESPACE pg_default;</w:t>
-      </w:r>
-    </w:p>
-    <w:p>
-      <w:pPr>
-        <w:pStyle w:val="NoSpacing"/>
-      </w:pPr>
-    </w:p>
-    <w:p>
-      <w:pPr>
-        <w:pStyle w:val="NoSpacing"/>
-      </w:pPr>
-      <w:r>
-        <w:t>ALTER TABLE IF EXISTS public.isocodes</w:t>
-      </w:r>
-    </w:p>
-    <w:p>
-      <w:pPr>
-        <w:pStyle w:val="NoSpacing"/>
-      </w:pPr>
-      <w:r>
-        <w:t xml:space="preserve">    OWNER to postgres;</w:t>
-      </w:r>
-    </w:p>
-    <w:p>
-      <w:pPr>
-        <w:pStyle w:val="NoSpacing"/>
-      </w:pPr>
-    </w:p>
-    <w:p>
-      <w:pPr>
-        <w:pStyle w:val="NoSpacing"/>
-      </w:pPr>
-    </w:p>
-    <w:p>
-      <w:pPr>
-        <w:pStyle w:val="NoSpacing"/>
-      </w:pPr>
-    </w:p>
-    <w:p>
-      <w:pPr>
-        <w:pStyle w:val="NoSpacing"/>
-        <w:rPr>
-          <w:rFonts w:ascii="Calibri" w:hAnsi="Calibri" w:cs="Calibri"/>
-        </w:rPr>
-      </w:pPr>
-      <w:r>
-        <w:rPr>
-          <w:rFonts w:ascii="Calibri" w:hAnsi="Calibri" w:cs="Calibri"/>
-        </w:rPr>
-        <w:t>-- Table: public.allcountryenergy</w:t>
-      </w:r>
-    </w:p>
-    <w:p>
-      <w:pPr>
-        <w:pStyle w:val="NoSpacing"/>
-        <w:rPr>
-          <w:rFonts w:ascii="Calibri" w:hAnsi="Calibri" w:cs="Calibri"/>
-        </w:rPr>
-      </w:pPr>
-    </w:p>
-    <w:p>
-      <w:pPr>
-        <w:pStyle w:val="NoSpacing"/>
-        <w:rPr>
-          <w:rFonts w:ascii="Calibri" w:hAnsi="Calibri" w:cs="Calibri"/>
-        </w:rPr>
-      </w:pPr>
-      <w:r>
-        <w:rPr>
-          <w:rFonts w:ascii="Calibri" w:hAnsi="Calibri" w:cs="Calibri"/>
-        </w:rPr>
-        <w:t>-- DROP TABLE IF EXISTS public.allcountryenergy;</w:t>
-      </w:r>
-    </w:p>
-    <w:p>
-      <w:pPr>
-        <w:pStyle w:val="NoSpacing"/>
-        <w:rPr>
-          <w:rFonts w:ascii="Calibri" w:hAnsi="Calibri" w:cs="Calibri"/>
-        </w:rPr>
-      </w:pPr>
-    </w:p>
-    <w:p>
-      <w:pPr>
-        <w:pStyle w:val="NoSpacing"/>
-        <w:rPr>
-          <w:rFonts w:ascii="Calibri" w:hAnsi="Calibri" w:cs="Calibri"/>
-        </w:rPr>
-      </w:pPr>
-      <w:r>
-        <w:rPr>
-          <w:rFonts w:ascii="Calibri" w:hAnsi="Calibri" w:cs="Calibri"/>
-        </w:rPr>
-        <w:t>CREATE TABLE IF NOT EXISTS public.allcountryenergy</w:t>
-      </w:r>
+        <w:t xml:space="preserve">TABLESPACE </w:t>
+      </w:r>
+      <w:proofErr w:type="spellStart"/>
+      <w:r>
+        <w:t>pg_default</w:t>
+      </w:r>
+      <w:proofErr w:type="spellEnd"/>
+      <w:r>
+        <w:t>;</w:t>
+      </w:r>
+    </w:p>
+    <w:p>
+      <w:pPr>
+        <w:pStyle w:val="NoSpacing"/>
+      </w:pPr>
+    </w:p>
+    <w:p>
+      <w:pPr>
+        <w:pStyle w:val="NoSpacing"/>
+      </w:pPr>
+      <w:r>
+        <w:t xml:space="preserve">ALTER TABLE IF EXISTS </w:t>
+      </w:r>
+      <w:proofErr w:type="spellStart"/>
+      <w:r>
+        <w:t>public.isocodes</w:t>
+      </w:r>
+      <w:proofErr w:type="spellEnd"/>
+    </w:p>
+    <w:p>
+      <w:pPr>
+        <w:pStyle w:val="NoSpacing"/>
+      </w:pPr>
+      <w:r>
+        <w:t xml:space="preserve">    OWNER to </w:t>
+      </w:r>
+      <w:proofErr w:type="spellStart"/>
+      <w:r>
+        <w:t>postgres</w:t>
+      </w:r>
+      <w:proofErr w:type="spellEnd"/>
+      <w:r>
+        <w:t>;</w:t>
+      </w:r>
+    </w:p>
+    <w:p>
+      <w:pPr>
+        <w:pStyle w:val="NoSpacing"/>
+      </w:pPr>
+    </w:p>
+    <w:p>
+      <w:pPr>
+        <w:pStyle w:val="NoSpacing"/>
+      </w:pPr>
+    </w:p>
+    <w:p>
+      <w:pPr>
+        <w:pStyle w:val="NoSpacing"/>
+      </w:pPr>
+    </w:p>
+    <w:p>
+      <w:pPr>
+        <w:pStyle w:val="NoSpacing"/>
+        <w:rPr>
+          <w:rFonts w:ascii="Calibri" w:hAnsi="Calibri" w:cs="Calibri"/>
+        </w:rPr>
+      </w:pPr>
+      <w:r>
+        <w:rPr>
+          <w:rFonts w:ascii="Calibri" w:hAnsi="Calibri" w:cs="Calibri"/>
+        </w:rPr>
+        <w:t xml:space="preserve">-- Table: </w:t>
+      </w:r>
+      <w:proofErr w:type="spellStart"/>
+      <w:r>
+        <w:rPr>
+          <w:rFonts w:ascii="Calibri" w:hAnsi="Calibri" w:cs="Calibri"/>
+        </w:rPr>
+        <w:t>public.allcountryenergy</w:t>
+      </w:r>
+      <w:proofErr w:type="spellEnd"/>
+    </w:p>
+    <w:p>
+      <w:pPr>
+        <w:pStyle w:val="NoSpacing"/>
+        <w:rPr>
+          <w:rFonts w:ascii="Calibri" w:hAnsi="Calibri" w:cs="Calibri"/>
+        </w:rPr>
+      </w:pPr>
+    </w:p>
+    <w:p>
+      <w:pPr>
+        <w:pStyle w:val="NoSpacing"/>
+        <w:rPr>
+          <w:rFonts w:ascii="Calibri" w:hAnsi="Calibri" w:cs="Calibri"/>
+        </w:rPr>
+      </w:pPr>
+      <w:r>
+        <w:rPr>
+          <w:rFonts w:ascii="Calibri" w:hAnsi="Calibri" w:cs="Calibri"/>
+        </w:rPr>
+        <w:t xml:space="preserve">-- DROP TABLE IF EXISTS </w:t>
+      </w:r>
+      <w:proofErr w:type="spellStart"/>
+      <w:r>
+        <w:rPr>
+          <w:rFonts w:ascii="Calibri" w:hAnsi="Calibri" w:cs="Calibri"/>
+        </w:rPr>
+        <w:t>public.allcountryenergy</w:t>
+      </w:r>
+      <w:proofErr w:type="spellEnd"/>
+      <w:r>
+        <w:rPr>
+          <w:rFonts w:ascii="Calibri" w:hAnsi="Calibri" w:cs="Calibri"/>
+        </w:rPr>
+        <w:t>;</w:t>
+      </w:r>
+    </w:p>
+    <w:p>
+      <w:pPr>
+        <w:pStyle w:val="NoSpacing"/>
+        <w:rPr>
+          <w:rFonts w:ascii="Calibri" w:hAnsi="Calibri" w:cs="Calibri"/>
+        </w:rPr>
+      </w:pPr>
+    </w:p>
+    <w:p>
+      <w:pPr>
+        <w:pStyle w:val="NoSpacing"/>
+        <w:rPr>
+          <w:rFonts w:ascii="Calibri" w:hAnsi="Calibri" w:cs="Calibri"/>
+        </w:rPr>
+      </w:pPr>
+      <w:r>
+        <w:rPr>
+          <w:rFonts w:ascii="Calibri" w:hAnsi="Calibri" w:cs="Calibri"/>
+        </w:rPr>
+        <w:t xml:space="preserve">CREATE TABLE IF NOT EXISTS </w:t>
+      </w:r>
+      <w:proofErr w:type="spellStart"/>
+      <w:r>
+        <w:rPr>
+          <w:rFonts w:ascii="Calibri" w:hAnsi="Calibri" w:cs="Calibri"/>
+        </w:rPr>
+        <w:t>public.allcountryenergy</w:t>
+      </w:r>
+      <w:proofErr w:type="spellEnd"/>
     </w:p>
     <w:p>
       <w:pPr>
@@ -452,21 +599,63 @@
         <w:rPr>
           <w:rFonts w:ascii="Calibri" w:hAnsi="Calibri" w:cs="Calibri"/>
         </w:rPr>
-        <w:t xml:space="preserve">    country text COLLATE pg_catalog."default",</w:t>
-      </w:r>
-    </w:p>
-    <w:p>
-      <w:pPr>
-        <w:pStyle w:val="NoSpacing"/>
-        <w:rPr>
-          <w:rFonts w:ascii="Calibri" w:hAnsi="Calibri" w:cs="Calibri"/>
-        </w:rPr>
-      </w:pPr>
-      <w:r>
-        <w:rPr>
-          <w:rFonts w:ascii="Calibri" w:hAnsi="Calibri" w:cs="Calibri"/>
-        </w:rPr>
-        <w:t xml:space="preserve">    iso_code character varying(5) COLLATE pg_catalog."default" ,</w:t>
+        <w:t xml:space="preserve">    country text COLLATE </w:t>
+      </w:r>
+      <w:proofErr w:type="spellStart"/>
+      <w:r>
+        <w:rPr>
+          <w:rFonts w:ascii="Calibri" w:hAnsi="Calibri" w:cs="Calibri"/>
+        </w:rPr>
+        <w:t>pg_catalog."default</w:t>
+      </w:r>
+      <w:proofErr w:type="spellEnd"/>
+      <w:r>
+        <w:rPr>
+          <w:rFonts w:ascii="Calibri" w:hAnsi="Calibri" w:cs="Calibri"/>
+        </w:rPr>
+        <w:t>",</w:t>
+      </w:r>
+    </w:p>
+    <w:p>
+      <w:pPr>
+        <w:pStyle w:val="NoSpacing"/>
+        <w:rPr>
+          <w:rFonts w:ascii="Calibri" w:hAnsi="Calibri" w:cs="Calibri"/>
+        </w:rPr>
+      </w:pPr>
+      <w:r>
+        <w:rPr>
+          <w:rFonts w:ascii="Calibri" w:hAnsi="Calibri" w:cs="Calibri"/>
+        </w:rPr>
+        <w:t xml:space="preserve">    </w:t>
+      </w:r>
+      <w:proofErr w:type="spellStart"/>
+      <w:r>
+        <w:rPr>
+          <w:rFonts w:ascii="Calibri" w:hAnsi="Calibri" w:cs="Calibri"/>
+        </w:rPr>
+        <w:t>iso_code</w:t>
+      </w:r>
+      <w:proofErr w:type="spellEnd"/>
+      <w:r>
+        <w:rPr>
+          <w:rFonts w:ascii="Calibri" w:hAnsi="Calibri" w:cs="Calibri"/>
+        </w:rPr>
+        <w:t xml:space="preserve"> character varying(5) COLLATE </w:t>
+      </w:r>
+      <w:proofErr w:type="spellStart"/>
+      <w:r>
+        <w:rPr>
+          <w:rFonts w:ascii="Calibri" w:hAnsi="Calibri" w:cs="Calibri"/>
+        </w:rPr>
+        <w:t>pg_catalog."default</w:t>
+      </w:r>
+      <w:proofErr w:type="spellEnd"/>
+      <w:r>
+        <w:rPr>
+          <w:rFonts w:ascii="Calibri" w:hAnsi="Calibri" w:cs="Calibri"/>
+        </w:rPr>
+        <w:t>" ,</w:t>
       </w:r>
     </w:p>
     <w:p>
@@ -494,469 +683,945 @@
         <w:rPr>
           <w:rFonts w:ascii="Calibri" w:hAnsi="Calibri" w:cs="Calibri"/>
         </w:rPr>
-        <w:t xml:space="preserve">    biofuel_consumption integer,</w:t>
-      </w:r>
-    </w:p>
-    <w:p>
-      <w:pPr>
-        <w:pStyle w:val="NoSpacing"/>
-        <w:rPr>
-          <w:rFonts w:ascii="Calibri" w:hAnsi="Calibri" w:cs="Calibri"/>
-        </w:rPr>
-      </w:pPr>
-      <w:r>
-        <w:rPr>
-          <w:rFonts w:ascii="Calibri" w:hAnsi="Calibri" w:cs="Calibri"/>
-        </w:rPr>
-        <w:t xml:space="preserve">    coal_consumption integer,</w:t>
-      </w:r>
-    </w:p>
-    <w:p>
-      <w:pPr>
-        <w:pStyle w:val="NoSpacing"/>
-        <w:rPr>
-          <w:rFonts w:ascii="Calibri" w:hAnsi="Calibri" w:cs="Calibri"/>
-        </w:rPr>
-      </w:pPr>
-      <w:r>
-        <w:rPr>
-          <w:rFonts w:ascii="Calibri" w:hAnsi="Calibri" w:cs="Calibri"/>
-        </w:rPr>
-        <w:t xml:space="preserve">    coal_production integer,</w:t>
-      </w:r>
-    </w:p>
-    <w:p>
-      <w:pPr>
-        <w:pStyle w:val="NoSpacing"/>
-        <w:rPr>
-          <w:rFonts w:ascii="Calibri" w:hAnsi="Calibri" w:cs="Calibri"/>
-        </w:rPr>
-      </w:pPr>
-      <w:r>
-        <w:rPr>
-          <w:rFonts w:ascii="Calibri" w:hAnsi="Calibri" w:cs="Calibri"/>
-        </w:rPr>
-        <w:t xml:space="preserve">    electricity_demand integer,</w:t>
-      </w:r>
-    </w:p>
-    <w:p>
-      <w:pPr>
-        <w:pStyle w:val="NoSpacing"/>
-        <w:rPr>
-          <w:rFonts w:ascii="Calibri" w:hAnsi="Calibri" w:cs="Calibri"/>
-        </w:rPr>
-      </w:pPr>
-      <w:r>
-        <w:rPr>
-          <w:rFonts w:ascii="Calibri" w:hAnsi="Calibri" w:cs="Calibri"/>
-        </w:rPr>
-        <w:t xml:space="preserve">    biofuel_electricity integer,</w:t>
-      </w:r>
-    </w:p>
-    <w:p>
-      <w:pPr>
-        <w:pStyle w:val="NoSpacing"/>
-        <w:rPr>
-          <w:rFonts w:ascii="Calibri" w:hAnsi="Calibri" w:cs="Calibri"/>
-        </w:rPr>
-      </w:pPr>
-      <w:r>
-        <w:rPr>
-          <w:rFonts w:ascii="Calibri" w:hAnsi="Calibri" w:cs="Calibri"/>
-        </w:rPr>
-        <w:t xml:space="preserve">    coal_electricity integer,</w:t>
-      </w:r>
-    </w:p>
-    <w:p>
-      <w:pPr>
-        <w:pStyle w:val="NoSpacing"/>
-        <w:rPr>
-          <w:rFonts w:ascii="Calibri" w:hAnsi="Calibri" w:cs="Calibri"/>
-        </w:rPr>
-      </w:pPr>
-      <w:r>
-        <w:rPr>
-          <w:rFonts w:ascii="Calibri" w:hAnsi="Calibri" w:cs="Calibri"/>
-        </w:rPr>
-        <w:t xml:space="preserve">    fossil_electricity integer,</w:t>
-      </w:r>
-    </w:p>
-    <w:p>
-      <w:pPr>
-        <w:pStyle w:val="NoSpacing"/>
-        <w:rPr>
-          <w:rFonts w:ascii="Calibri" w:hAnsi="Calibri" w:cs="Calibri"/>
-        </w:rPr>
-      </w:pPr>
-      <w:r>
-        <w:rPr>
-          <w:rFonts w:ascii="Calibri" w:hAnsi="Calibri" w:cs="Calibri"/>
-        </w:rPr>
-        <w:t xml:space="preserve">    gas_electricity integer,</w:t>
-      </w:r>
-    </w:p>
-    <w:p>
-      <w:pPr>
-        <w:pStyle w:val="NoSpacing"/>
-        <w:rPr>
-          <w:rFonts w:ascii="Calibri" w:hAnsi="Calibri" w:cs="Calibri"/>
-        </w:rPr>
-      </w:pPr>
-      <w:r>
-        <w:rPr>
-          <w:rFonts w:ascii="Calibri" w:hAnsi="Calibri" w:cs="Calibri"/>
-        </w:rPr>
-        <w:t xml:space="preserve">    hydro_electricity integer,</w:t>
-      </w:r>
-    </w:p>
-    <w:p>
-      <w:pPr>
-        <w:pStyle w:val="NoSpacing"/>
-        <w:rPr>
-          <w:rFonts w:ascii="Calibri" w:hAnsi="Calibri" w:cs="Calibri"/>
-        </w:rPr>
-      </w:pPr>
-      <w:r>
-        <w:rPr>
-          <w:rFonts w:ascii="Calibri" w:hAnsi="Calibri" w:cs="Calibri"/>
-        </w:rPr>
-        <w:t xml:space="preserve">    nuclear_electricity integer,</w:t>
-      </w:r>
-    </w:p>
-    <w:p>
-      <w:pPr>
-        <w:pStyle w:val="NoSpacing"/>
-        <w:rPr>
-          <w:rFonts w:ascii="Calibri" w:hAnsi="Calibri" w:cs="Calibri"/>
-        </w:rPr>
-      </w:pPr>
-      <w:r>
-        <w:rPr>
-          <w:rFonts w:ascii="Calibri" w:hAnsi="Calibri" w:cs="Calibri"/>
-        </w:rPr>
-        <w:t xml:space="preserve">    oil_electricity integer,</w:t>
-      </w:r>
-    </w:p>
-    <w:p>
-      <w:pPr>
-        <w:pStyle w:val="NoSpacing"/>
-        <w:rPr>
-          <w:rFonts w:ascii="Calibri" w:hAnsi="Calibri" w:cs="Calibri"/>
-        </w:rPr>
-      </w:pPr>
-      <w:r>
-        <w:rPr>
-          <w:rFonts w:ascii="Calibri" w:hAnsi="Calibri" w:cs="Calibri"/>
-        </w:rPr>
-        <w:t xml:space="preserve">    other_renewable_exc_biofuel_electricity integer,</w:t>
-      </w:r>
-    </w:p>
-    <w:p>
-      <w:pPr>
-        <w:pStyle w:val="NoSpacing"/>
-        <w:rPr>
-          <w:rFonts w:ascii="Calibri" w:hAnsi="Calibri" w:cs="Calibri"/>
-        </w:rPr>
-      </w:pPr>
-      <w:r>
-        <w:rPr>
-          <w:rFonts w:ascii="Calibri" w:hAnsi="Calibri" w:cs="Calibri"/>
-        </w:rPr>
-        <w:t xml:space="preserve">    other_renewable_electricity integer,</w:t>
-      </w:r>
-    </w:p>
-    <w:p>
-      <w:pPr>
-        <w:pStyle w:val="NoSpacing"/>
-        <w:rPr>
-          <w:rFonts w:ascii="Calibri" w:hAnsi="Calibri" w:cs="Calibri"/>
-        </w:rPr>
-      </w:pPr>
-      <w:r>
-        <w:rPr>
-          <w:rFonts w:ascii="Calibri" w:hAnsi="Calibri" w:cs="Calibri"/>
-        </w:rPr>
-        <w:t xml:space="preserve">    renewables_electricity integer,</w:t>
-      </w:r>
-    </w:p>
-    <w:p>
-      <w:pPr>
-        <w:pStyle w:val="NoSpacing"/>
-        <w:rPr>
-          <w:rFonts w:ascii="Calibri" w:hAnsi="Calibri" w:cs="Calibri"/>
-        </w:rPr>
-      </w:pPr>
-      <w:r>
-        <w:rPr>
-          <w:rFonts w:ascii="Calibri" w:hAnsi="Calibri" w:cs="Calibri"/>
-        </w:rPr>
-        <w:t xml:space="preserve">    solar_electricity integer,</w:t>
-      </w:r>
-    </w:p>
-    <w:p>
-      <w:pPr>
-        <w:pStyle w:val="NoSpacing"/>
-        <w:rPr>
-          <w:rFonts w:ascii="Calibri" w:hAnsi="Calibri" w:cs="Calibri"/>
-        </w:rPr>
-      </w:pPr>
-      <w:r>
-        <w:rPr>
-          <w:rFonts w:ascii="Calibri" w:hAnsi="Calibri" w:cs="Calibri"/>
-        </w:rPr>
-        <w:t xml:space="preserve">    wind_electricity integer,</w:t>
-      </w:r>
-    </w:p>
-    <w:p>
-      <w:pPr>
-        <w:pStyle w:val="NoSpacing"/>
-        <w:rPr>
-          <w:rFonts w:ascii="Calibri" w:hAnsi="Calibri" w:cs="Calibri"/>
-        </w:rPr>
-      </w:pPr>
-      <w:r>
-        <w:rPr>
-          <w:rFonts w:ascii="Calibri" w:hAnsi="Calibri" w:cs="Calibri"/>
-        </w:rPr>
-        <w:t xml:space="preserve">    electricity_generation integer,</w:t>
-      </w:r>
-    </w:p>
-    <w:p>
-      <w:pPr>
-        <w:pStyle w:val="NoSpacing"/>
-        <w:rPr>
-          <w:rFonts w:ascii="Calibri" w:hAnsi="Calibri" w:cs="Calibri"/>
-        </w:rPr>
-      </w:pPr>
-      <w:r>
-        <w:rPr>
-          <w:rFonts w:ascii="Calibri" w:hAnsi="Calibri" w:cs="Calibri"/>
-        </w:rPr>
-        <w:t xml:space="preserve">    fossil_fuel_consumption integer,</w:t>
-      </w:r>
-    </w:p>
-    <w:p>
-      <w:pPr>
-        <w:pStyle w:val="NoSpacing"/>
-        <w:rPr>
-          <w:rFonts w:ascii="Calibri" w:hAnsi="Calibri" w:cs="Calibri"/>
-        </w:rPr>
-      </w:pPr>
-      <w:r>
-        <w:rPr>
-          <w:rFonts w:ascii="Calibri" w:hAnsi="Calibri" w:cs="Calibri"/>
-        </w:rPr>
-        <w:t xml:space="preserve">    gas_consumption integer,</w:t>
-      </w:r>
-    </w:p>
-    <w:p>
-      <w:pPr>
-        <w:pStyle w:val="NoSpacing"/>
-        <w:rPr>
-          <w:rFonts w:ascii="Calibri" w:hAnsi="Calibri" w:cs="Calibri"/>
-        </w:rPr>
-      </w:pPr>
-      <w:r>
-        <w:rPr>
-          <w:rFonts w:ascii="Calibri" w:hAnsi="Calibri" w:cs="Calibri"/>
-        </w:rPr>
-        <w:t xml:space="preserve">    gas_production integer,</w:t>
-      </w:r>
-    </w:p>
-    <w:p>
-      <w:pPr>
-        <w:pStyle w:val="NoSpacing"/>
-        <w:rPr>
-          <w:rFonts w:ascii="Calibri" w:hAnsi="Calibri" w:cs="Calibri"/>
-        </w:rPr>
-      </w:pPr>
-      <w:r>
-        <w:rPr>
-          <w:rFonts w:ascii="Calibri" w:hAnsi="Calibri" w:cs="Calibri"/>
-        </w:rPr>
-        <w:t xml:space="preserve">    hydro_consumption integer,</w:t>
-      </w:r>
-    </w:p>
-    <w:p>
-      <w:pPr>
-        <w:pStyle w:val="NoSpacing"/>
-        <w:rPr>
-          <w:rFonts w:ascii="Calibri" w:hAnsi="Calibri" w:cs="Calibri"/>
-        </w:rPr>
-      </w:pPr>
-      <w:r>
-        <w:rPr>
-          <w:rFonts w:ascii="Calibri" w:hAnsi="Calibri" w:cs="Calibri"/>
-        </w:rPr>
-        <w:t xml:space="preserve">    low_carbon_consumption integer,</w:t>
-      </w:r>
-    </w:p>
-    <w:p>
-      <w:pPr>
-        <w:pStyle w:val="NoSpacing"/>
-        <w:rPr>
-          <w:rFonts w:ascii="Calibri" w:hAnsi="Calibri" w:cs="Calibri"/>
-        </w:rPr>
-      </w:pPr>
-      <w:r>
-        <w:rPr>
-          <w:rFonts w:ascii="Calibri" w:hAnsi="Calibri" w:cs="Calibri"/>
-        </w:rPr>
-        <w:t xml:space="preserve">    nuclear_consumption integer,</w:t>
-      </w:r>
-    </w:p>
-    <w:p>
-      <w:pPr>
-        <w:pStyle w:val="NoSpacing"/>
-        <w:rPr>
-          <w:rFonts w:ascii="Calibri" w:hAnsi="Calibri" w:cs="Calibri"/>
-        </w:rPr>
-      </w:pPr>
-      <w:r>
-        <w:rPr>
-          <w:rFonts w:ascii="Calibri" w:hAnsi="Calibri" w:cs="Calibri"/>
-        </w:rPr>
-        <w:t xml:space="preserve">    oil_consumption integer,</w:t>
-      </w:r>
-    </w:p>
-    <w:p>
-      <w:pPr>
-        <w:pStyle w:val="NoSpacing"/>
-        <w:rPr>
-          <w:rFonts w:ascii="Calibri" w:hAnsi="Calibri" w:cs="Calibri"/>
-        </w:rPr>
-      </w:pPr>
-      <w:r>
-        <w:rPr>
-          <w:rFonts w:ascii="Calibri" w:hAnsi="Calibri" w:cs="Calibri"/>
-        </w:rPr>
-        <w:t xml:space="preserve">    oil_production integer,</w:t>
-      </w:r>
-    </w:p>
-    <w:p>
-      <w:pPr>
-        <w:pStyle w:val="NoSpacing"/>
-        <w:rPr>
-          <w:rFonts w:ascii="Calibri" w:hAnsi="Calibri" w:cs="Calibri"/>
-        </w:rPr>
-      </w:pPr>
-      <w:r>
-        <w:rPr>
-          <w:rFonts w:ascii="Calibri" w:hAnsi="Calibri" w:cs="Calibri"/>
-        </w:rPr>
-        <w:t xml:space="preserve">    other_renewables_cons_change_pct integer,</w:t>
-      </w:r>
-    </w:p>
-    <w:p>
-      <w:pPr>
-        <w:pStyle w:val="NoSpacing"/>
-        <w:rPr>
-          <w:rFonts w:ascii="Calibri" w:hAnsi="Calibri" w:cs="Calibri"/>
-        </w:rPr>
-      </w:pPr>
-      <w:r>
-        <w:rPr>
-          <w:rFonts w:ascii="Calibri" w:hAnsi="Calibri" w:cs="Calibri"/>
-        </w:rPr>
-        <w:t xml:space="preserve">    other_renewables_share_energy integer,</w:t>
-      </w:r>
-    </w:p>
-    <w:p>
-      <w:pPr>
-        <w:pStyle w:val="NoSpacing"/>
-        <w:rPr>
-          <w:rFonts w:ascii="Calibri" w:hAnsi="Calibri" w:cs="Calibri"/>
-        </w:rPr>
-      </w:pPr>
-      <w:r>
-        <w:rPr>
-          <w:rFonts w:ascii="Calibri" w:hAnsi="Calibri" w:cs="Calibri"/>
-        </w:rPr>
-        <w:t xml:space="preserve">    other_renewables_cons_change_twh integer,</w:t>
-      </w:r>
-    </w:p>
-    <w:p>
-      <w:pPr>
-        <w:pStyle w:val="NoSpacing"/>
-        <w:rPr>
-          <w:rFonts w:ascii="Calibri" w:hAnsi="Calibri" w:cs="Calibri"/>
-        </w:rPr>
-      </w:pPr>
-      <w:r>
-        <w:rPr>
-          <w:rFonts w:ascii="Calibri" w:hAnsi="Calibri" w:cs="Calibri"/>
-        </w:rPr>
-        <w:t xml:space="preserve">    other_renewable_consumption integer,</w:t>
-      </w:r>
-    </w:p>
-    <w:p>
-      <w:pPr>
-        <w:pStyle w:val="NoSpacing"/>
-        <w:rPr>
-          <w:rFonts w:ascii="Calibri" w:hAnsi="Calibri" w:cs="Calibri"/>
-        </w:rPr>
-      </w:pPr>
-      <w:r>
-        <w:rPr>
-          <w:rFonts w:ascii="Calibri" w:hAnsi="Calibri" w:cs="Calibri"/>
-        </w:rPr>
-        <w:t xml:space="preserve">    other_renewables_share_elec integer,</w:t>
-      </w:r>
-    </w:p>
-    <w:p>
-      <w:pPr>
-        <w:pStyle w:val="NoSpacing"/>
-        <w:rPr>
-          <w:rFonts w:ascii="Calibri" w:hAnsi="Calibri" w:cs="Calibri"/>
-        </w:rPr>
-      </w:pPr>
-      <w:r>
-        <w:rPr>
-          <w:rFonts w:ascii="Calibri" w:hAnsi="Calibri" w:cs="Calibri"/>
-        </w:rPr>
-        <w:t xml:space="preserve">    primary_energy_consumption integer,</w:t>
-      </w:r>
-    </w:p>
-    <w:p>
-      <w:pPr>
-        <w:pStyle w:val="NoSpacing"/>
-        <w:rPr>
-          <w:rFonts w:ascii="Calibri" w:hAnsi="Calibri" w:cs="Calibri"/>
-        </w:rPr>
-      </w:pPr>
-      <w:r>
-        <w:rPr>
-          <w:rFonts w:ascii="Calibri" w:hAnsi="Calibri" w:cs="Calibri"/>
-        </w:rPr>
-        <w:t xml:space="preserve">    renewables_share_elec integer,</w:t>
-      </w:r>
-    </w:p>
-    <w:p>
-      <w:pPr>
-        <w:pStyle w:val="NoSpacing"/>
-        <w:rPr>
-          <w:rFonts w:ascii="Calibri" w:hAnsi="Calibri" w:cs="Calibri"/>
-        </w:rPr>
-      </w:pPr>
-      <w:r>
-        <w:rPr>
-          <w:rFonts w:ascii="Calibri" w:hAnsi="Calibri" w:cs="Calibri"/>
-        </w:rPr>
-        <w:t xml:space="preserve">    renewables_share_energy integer,</w:t>
-      </w:r>
-    </w:p>
-    <w:p>
-      <w:pPr>
-        <w:pStyle w:val="NoSpacing"/>
-        <w:rPr>
-          <w:rFonts w:ascii="Calibri" w:hAnsi="Calibri" w:cs="Calibri"/>
-        </w:rPr>
-      </w:pPr>
-      <w:r>
-        <w:rPr>
-          <w:rFonts w:ascii="Calibri" w:hAnsi="Calibri" w:cs="Calibri"/>
-        </w:rPr>
-        <w:t xml:space="preserve">    renewables_consumption integer,</w:t>
+        <w:t xml:space="preserve">    </w:t>
+      </w:r>
+      <w:proofErr w:type="spellStart"/>
+      <w:r>
+        <w:rPr>
+          <w:rFonts w:ascii="Calibri" w:hAnsi="Calibri" w:cs="Calibri"/>
+        </w:rPr>
+        <w:t>biofuel_consumption</w:t>
+      </w:r>
+      <w:proofErr w:type="spellEnd"/>
+      <w:r>
+        <w:rPr>
+          <w:rFonts w:ascii="Calibri" w:hAnsi="Calibri" w:cs="Calibri"/>
+        </w:rPr>
+        <w:t xml:space="preserve"> integer,</w:t>
+      </w:r>
+    </w:p>
+    <w:p>
+      <w:pPr>
+        <w:pStyle w:val="NoSpacing"/>
+        <w:rPr>
+          <w:rFonts w:ascii="Calibri" w:hAnsi="Calibri" w:cs="Calibri"/>
+        </w:rPr>
+      </w:pPr>
+      <w:r>
+        <w:rPr>
+          <w:rFonts w:ascii="Calibri" w:hAnsi="Calibri" w:cs="Calibri"/>
+        </w:rPr>
+        <w:t xml:space="preserve">    </w:t>
+      </w:r>
+      <w:proofErr w:type="spellStart"/>
+      <w:r>
+        <w:rPr>
+          <w:rFonts w:ascii="Calibri" w:hAnsi="Calibri" w:cs="Calibri"/>
+        </w:rPr>
+        <w:t>coal_consumption</w:t>
+      </w:r>
+      <w:proofErr w:type="spellEnd"/>
+      <w:r>
+        <w:rPr>
+          <w:rFonts w:ascii="Calibri" w:hAnsi="Calibri" w:cs="Calibri"/>
+        </w:rPr>
+        <w:t xml:space="preserve"> integer,</w:t>
+      </w:r>
+    </w:p>
+    <w:p>
+      <w:pPr>
+        <w:pStyle w:val="NoSpacing"/>
+        <w:rPr>
+          <w:rFonts w:ascii="Calibri" w:hAnsi="Calibri" w:cs="Calibri"/>
+        </w:rPr>
+      </w:pPr>
+      <w:r>
+        <w:rPr>
+          <w:rFonts w:ascii="Calibri" w:hAnsi="Calibri" w:cs="Calibri"/>
+        </w:rPr>
+        <w:t xml:space="preserve">    </w:t>
+      </w:r>
+      <w:proofErr w:type="spellStart"/>
+      <w:r>
+        <w:rPr>
+          <w:rFonts w:ascii="Calibri" w:hAnsi="Calibri" w:cs="Calibri"/>
+        </w:rPr>
+        <w:t>coal_production</w:t>
+      </w:r>
+      <w:proofErr w:type="spellEnd"/>
+      <w:r>
+        <w:rPr>
+          <w:rFonts w:ascii="Calibri" w:hAnsi="Calibri" w:cs="Calibri"/>
+        </w:rPr>
+        <w:t xml:space="preserve"> integer,</w:t>
+      </w:r>
+    </w:p>
+    <w:p>
+      <w:pPr>
+        <w:pStyle w:val="NoSpacing"/>
+        <w:rPr>
+          <w:rFonts w:ascii="Calibri" w:hAnsi="Calibri" w:cs="Calibri"/>
+        </w:rPr>
+      </w:pPr>
+      <w:r>
+        <w:rPr>
+          <w:rFonts w:ascii="Calibri" w:hAnsi="Calibri" w:cs="Calibri"/>
+        </w:rPr>
+        <w:t xml:space="preserve">    </w:t>
+      </w:r>
+      <w:proofErr w:type="spellStart"/>
+      <w:r>
+        <w:rPr>
+          <w:rFonts w:ascii="Calibri" w:hAnsi="Calibri" w:cs="Calibri"/>
+        </w:rPr>
+        <w:t>electricity_demand</w:t>
+      </w:r>
+      <w:proofErr w:type="spellEnd"/>
+      <w:r>
+        <w:rPr>
+          <w:rFonts w:ascii="Calibri" w:hAnsi="Calibri" w:cs="Calibri"/>
+        </w:rPr>
+        <w:t xml:space="preserve"> integer,</w:t>
+      </w:r>
+    </w:p>
+    <w:p>
+      <w:pPr>
+        <w:pStyle w:val="NoSpacing"/>
+        <w:rPr>
+          <w:rFonts w:ascii="Calibri" w:hAnsi="Calibri" w:cs="Calibri"/>
+        </w:rPr>
+      </w:pPr>
+      <w:r>
+        <w:rPr>
+          <w:rFonts w:ascii="Calibri" w:hAnsi="Calibri" w:cs="Calibri"/>
+        </w:rPr>
+        <w:t xml:space="preserve">    </w:t>
+      </w:r>
+      <w:proofErr w:type="spellStart"/>
+      <w:r>
+        <w:rPr>
+          <w:rFonts w:ascii="Calibri" w:hAnsi="Calibri" w:cs="Calibri"/>
+        </w:rPr>
+        <w:t>biofuel_electricity</w:t>
+      </w:r>
+      <w:proofErr w:type="spellEnd"/>
+      <w:r>
+        <w:rPr>
+          <w:rFonts w:ascii="Calibri" w:hAnsi="Calibri" w:cs="Calibri"/>
+        </w:rPr>
+        <w:t xml:space="preserve"> integer,</w:t>
+      </w:r>
+    </w:p>
+    <w:p>
+      <w:pPr>
+        <w:pStyle w:val="NoSpacing"/>
+        <w:rPr>
+          <w:rFonts w:ascii="Calibri" w:hAnsi="Calibri" w:cs="Calibri"/>
+        </w:rPr>
+      </w:pPr>
+      <w:r>
+        <w:rPr>
+          <w:rFonts w:ascii="Calibri" w:hAnsi="Calibri" w:cs="Calibri"/>
+        </w:rPr>
+        <w:t xml:space="preserve">    </w:t>
+      </w:r>
+      <w:proofErr w:type="spellStart"/>
+      <w:r>
+        <w:rPr>
+          <w:rFonts w:ascii="Calibri" w:hAnsi="Calibri" w:cs="Calibri"/>
+        </w:rPr>
+        <w:t>coal_electricity</w:t>
+      </w:r>
+      <w:proofErr w:type="spellEnd"/>
+      <w:r>
+        <w:rPr>
+          <w:rFonts w:ascii="Calibri" w:hAnsi="Calibri" w:cs="Calibri"/>
+        </w:rPr>
+        <w:t xml:space="preserve"> integer,</w:t>
+      </w:r>
+    </w:p>
+    <w:p>
+      <w:pPr>
+        <w:pStyle w:val="NoSpacing"/>
+        <w:rPr>
+          <w:rFonts w:ascii="Calibri" w:hAnsi="Calibri" w:cs="Calibri"/>
+        </w:rPr>
+      </w:pPr>
+      <w:r>
+        <w:rPr>
+          <w:rFonts w:ascii="Calibri" w:hAnsi="Calibri" w:cs="Calibri"/>
+        </w:rPr>
+        <w:t xml:space="preserve">    </w:t>
+      </w:r>
+      <w:proofErr w:type="spellStart"/>
+      <w:r>
+        <w:rPr>
+          <w:rFonts w:ascii="Calibri" w:hAnsi="Calibri" w:cs="Calibri"/>
+        </w:rPr>
+        <w:t>fossil_electricity</w:t>
+      </w:r>
+      <w:proofErr w:type="spellEnd"/>
+      <w:r>
+        <w:rPr>
+          <w:rFonts w:ascii="Calibri" w:hAnsi="Calibri" w:cs="Calibri"/>
+        </w:rPr>
+        <w:t xml:space="preserve"> integer,</w:t>
+      </w:r>
+    </w:p>
+    <w:p>
+      <w:pPr>
+        <w:pStyle w:val="NoSpacing"/>
+        <w:rPr>
+          <w:rFonts w:ascii="Calibri" w:hAnsi="Calibri" w:cs="Calibri"/>
+        </w:rPr>
+      </w:pPr>
+      <w:r>
+        <w:rPr>
+          <w:rFonts w:ascii="Calibri" w:hAnsi="Calibri" w:cs="Calibri"/>
+        </w:rPr>
+        <w:t xml:space="preserve">    </w:t>
+      </w:r>
+      <w:proofErr w:type="spellStart"/>
+      <w:r>
+        <w:rPr>
+          <w:rFonts w:ascii="Calibri" w:hAnsi="Calibri" w:cs="Calibri"/>
+        </w:rPr>
+        <w:t>gas_electricity</w:t>
+      </w:r>
+      <w:proofErr w:type="spellEnd"/>
+      <w:r>
+        <w:rPr>
+          <w:rFonts w:ascii="Calibri" w:hAnsi="Calibri" w:cs="Calibri"/>
+        </w:rPr>
+        <w:t xml:space="preserve"> integer,</w:t>
+      </w:r>
+    </w:p>
+    <w:p>
+      <w:pPr>
+        <w:pStyle w:val="NoSpacing"/>
+        <w:rPr>
+          <w:rFonts w:ascii="Calibri" w:hAnsi="Calibri" w:cs="Calibri"/>
+        </w:rPr>
+      </w:pPr>
+      <w:r>
+        <w:rPr>
+          <w:rFonts w:ascii="Calibri" w:hAnsi="Calibri" w:cs="Calibri"/>
+        </w:rPr>
+        <w:t xml:space="preserve">    </w:t>
+      </w:r>
+      <w:proofErr w:type="spellStart"/>
+      <w:r>
+        <w:rPr>
+          <w:rFonts w:ascii="Calibri" w:hAnsi="Calibri" w:cs="Calibri"/>
+        </w:rPr>
+        <w:t>hydro_electricity</w:t>
+      </w:r>
+      <w:proofErr w:type="spellEnd"/>
+      <w:r>
+        <w:rPr>
+          <w:rFonts w:ascii="Calibri" w:hAnsi="Calibri" w:cs="Calibri"/>
+        </w:rPr>
+        <w:t xml:space="preserve"> integer,</w:t>
+      </w:r>
+    </w:p>
+    <w:p>
+      <w:pPr>
+        <w:pStyle w:val="NoSpacing"/>
+        <w:rPr>
+          <w:rFonts w:ascii="Calibri" w:hAnsi="Calibri" w:cs="Calibri"/>
+        </w:rPr>
+      </w:pPr>
+      <w:r>
+        <w:rPr>
+          <w:rFonts w:ascii="Calibri" w:hAnsi="Calibri" w:cs="Calibri"/>
+        </w:rPr>
+        <w:t xml:space="preserve">    </w:t>
+      </w:r>
+      <w:proofErr w:type="spellStart"/>
+      <w:r>
+        <w:rPr>
+          <w:rFonts w:ascii="Calibri" w:hAnsi="Calibri" w:cs="Calibri"/>
+        </w:rPr>
+        <w:t>nuclear_electricity</w:t>
+      </w:r>
+      <w:proofErr w:type="spellEnd"/>
+      <w:r>
+        <w:rPr>
+          <w:rFonts w:ascii="Calibri" w:hAnsi="Calibri" w:cs="Calibri"/>
+        </w:rPr>
+        <w:t xml:space="preserve"> integer,</w:t>
+      </w:r>
+    </w:p>
+    <w:p>
+      <w:pPr>
+        <w:pStyle w:val="NoSpacing"/>
+        <w:rPr>
+          <w:rFonts w:ascii="Calibri" w:hAnsi="Calibri" w:cs="Calibri"/>
+        </w:rPr>
+      </w:pPr>
+      <w:r>
+        <w:rPr>
+          <w:rFonts w:ascii="Calibri" w:hAnsi="Calibri" w:cs="Calibri"/>
+        </w:rPr>
+        <w:t xml:space="preserve">    </w:t>
+      </w:r>
+      <w:proofErr w:type="spellStart"/>
+      <w:r>
+        <w:rPr>
+          <w:rFonts w:ascii="Calibri" w:hAnsi="Calibri" w:cs="Calibri"/>
+        </w:rPr>
+        <w:t>oil_electricity</w:t>
+      </w:r>
+      <w:proofErr w:type="spellEnd"/>
+      <w:r>
+        <w:rPr>
+          <w:rFonts w:ascii="Calibri" w:hAnsi="Calibri" w:cs="Calibri"/>
+        </w:rPr>
+        <w:t xml:space="preserve"> integer,</w:t>
+      </w:r>
+    </w:p>
+    <w:p>
+      <w:pPr>
+        <w:pStyle w:val="NoSpacing"/>
+        <w:rPr>
+          <w:rFonts w:ascii="Calibri" w:hAnsi="Calibri" w:cs="Calibri"/>
+        </w:rPr>
+      </w:pPr>
+      <w:r>
+        <w:rPr>
+          <w:rFonts w:ascii="Calibri" w:hAnsi="Calibri" w:cs="Calibri"/>
+        </w:rPr>
+        <w:t xml:space="preserve">    </w:t>
+      </w:r>
+      <w:proofErr w:type="spellStart"/>
+      <w:r>
+        <w:rPr>
+          <w:rFonts w:ascii="Calibri" w:hAnsi="Calibri" w:cs="Calibri"/>
+        </w:rPr>
+        <w:t>other_renewable_exc_biofuel_electricity</w:t>
+      </w:r>
+      <w:proofErr w:type="spellEnd"/>
+      <w:r>
+        <w:rPr>
+          <w:rFonts w:ascii="Calibri" w:hAnsi="Calibri" w:cs="Calibri"/>
+        </w:rPr>
+        <w:t xml:space="preserve"> integer,</w:t>
+      </w:r>
+    </w:p>
+    <w:p>
+      <w:pPr>
+        <w:pStyle w:val="NoSpacing"/>
+        <w:rPr>
+          <w:rFonts w:ascii="Calibri" w:hAnsi="Calibri" w:cs="Calibri"/>
+        </w:rPr>
+      </w:pPr>
+      <w:r>
+        <w:rPr>
+          <w:rFonts w:ascii="Calibri" w:hAnsi="Calibri" w:cs="Calibri"/>
+        </w:rPr>
+        <w:t xml:space="preserve">    </w:t>
+      </w:r>
+      <w:proofErr w:type="spellStart"/>
+      <w:r>
+        <w:rPr>
+          <w:rFonts w:ascii="Calibri" w:hAnsi="Calibri" w:cs="Calibri"/>
+        </w:rPr>
+        <w:t>other_renewable_electricity</w:t>
+      </w:r>
+      <w:proofErr w:type="spellEnd"/>
+      <w:r>
+        <w:rPr>
+          <w:rFonts w:ascii="Calibri" w:hAnsi="Calibri" w:cs="Calibri"/>
+        </w:rPr>
+        <w:t xml:space="preserve"> integer,</w:t>
+      </w:r>
+    </w:p>
+    <w:p>
+      <w:pPr>
+        <w:pStyle w:val="NoSpacing"/>
+        <w:rPr>
+          <w:rFonts w:ascii="Calibri" w:hAnsi="Calibri" w:cs="Calibri"/>
+        </w:rPr>
+      </w:pPr>
+      <w:r>
+        <w:rPr>
+          <w:rFonts w:ascii="Calibri" w:hAnsi="Calibri" w:cs="Calibri"/>
+        </w:rPr>
+        <w:t xml:space="preserve">    </w:t>
+      </w:r>
+      <w:proofErr w:type="spellStart"/>
+      <w:r>
+        <w:rPr>
+          <w:rFonts w:ascii="Calibri" w:hAnsi="Calibri" w:cs="Calibri"/>
+        </w:rPr>
+        <w:t>renewables_electricity</w:t>
+      </w:r>
+      <w:proofErr w:type="spellEnd"/>
+      <w:r>
+        <w:rPr>
+          <w:rFonts w:ascii="Calibri" w:hAnsi="Calibri" w:cs="Calibri"/>
+        </w:rPr>
+        <w:t xml:space="preserve"> integer,</w:t>
+      </w:r>
+    </w:p>
+    <w:p>
+      <w:pPr>
+        <w:pStyle w:val="NoSpacing"/>
+        <w:rPr>
+          <w:rFonts w:ascii="Calibri" w:hAnsi="Calibri" w:cs="Calibri"/>
+        </w:rPr>
+      </w:pPr>
+      <w:r>
+        <w:rPr>
+          <w:rFonts w:ascii="Calibri" w:hAnsi="Calibri" w:cs="Calibri"/>
+        </w:rPr>
+        <w:t xml:space="preserve">    </w:t>
+      </w:r>
+      <w:proofErr w:type="spellStart"/>
+      <w:r>
+        <w:rPr>
+          <w:rFonts w:ascii="Calibri" w:hAnsi="Calibri" w:cs="Calibri"/>
+        </w:rPr>
+        <w:t>solar_electricity</w:t>
+      </w:r>
+      <w:proofErr w:type="spellEnd"/>
+      <w:r>
+        <w:rPr>
+          <w:rFonts w:ascii="Calibri" w:hAnsi="Calibri" w:cs="Calibri"/>
+        </w:rPr>
+        <w:t xml:space="preserve"> integer,</w:t>
+      </w:r>
+    </w:p>
+    <w:p>
+      <w:pPr>
+        <w:pStyle w:val="NoSpacing"/>
+        <w:rPr>
+          <w:rFonts w:ascii="Calibri" w:hAnsi="Calibri" w:cs="Calibri"/>
+        </w:rPr>
+      </w:pPr>
+      <w:r>
+        <w:rPr>
+          <w:rFonts w:ascii="Calibri" w:hAnsi="Calibri" w:cs="Calibri"/>
+        </w:rPr>
+        <w:t xml:space="preserve">    </w:t>
+      </w:r>
+      <w:proofErr w:type="spellStart"/>
+      <w:r>
+        <w:rPr>
+          <w:rFonts w:ascii="Calibri" w:hAnsi="Calibri" w:cs="Calibri"/>
+        </w:rPr>
+        <w:t>wind_electricity</w:t>
+      </w:r>
+      <w:proofErr w:type="spellEnd"/>
+      <w:r>
+        <w:rPr>
+          <w:rFonts w:ascii="Calibri" w:hAnsi="Calibri" w:cs="Calibri"/>
+        </w:rPr>
+        <w:t xml:space="preserve"> integer,</w:t>
+      </w:r>
+    </w:p>
+    <w:p>
+      <w:pPr>
+        <w:pStyle w:val="NoSpacing"/>
+        <w:rPr>
+          <w:rFonts w:ascii="Calibri" w:hAnsi="Calibri" w:cs="Calibri"/>
+        </w:rPr>
+      </w:pPr>
+      <w:r>
+        <w:rPr>
+          <w:rFonts w:ascii="Calibri" w:hAnsi="Calibri" w:cs="Calibri"/>
+        </w:rPr>
+        <w:t xml:space="preserve">    </w:t>
+      </w:r>
+      <w:proofErr w:type="spellStart"/>
+      <w:r>
+        <w:rPr>
+          <w:rFonts w:ascii="Calibri" w:hAnsi="Calibri" w:cs="Calibri"/>
+        </w:rPr>
+        <w:t>electricity_generation</w:t>
+      </w:r>
+      <w:proofErr w:type="spellEnd"/>
+      <w:r>
+        <w:rPr>
+          <w:rFonts w:ascii="Calibri" w:hAnsi="Calibri" w:cs="Calibri"/>
+        </w:rPr>
+        <w:t xml:space="preserve"> integer,</w:t>
+      </w:r>
+    </w:p>
+    <w:p>
+      <w:pPr>
+        <w:pStyle w:val="NoSpacing"/>
+        <w:rPr>
+          <w:rFonts w:ascii="Calibri" w:hAnsi="Calibri" w:cs="Calibri"/>
+        </w:rPr>
+      </w:pPr>
+      <w:r>
+        <w:rPr>
+          <w:rFonts w:ascii="Calibri" w:hAnsi="Calibri" w:cs="Calibri"/>
+        </w:rPr>
+        <w:t xml:space="preserve">    </w:t>
+      </w:r>
+      <w:proofErr w:type="spellStart"/>
+      <w:r>
+        <w:rPr>
+          <w:rFonts w:ascii="Calibri" w:hAnsi="Calibri" w:cs="Calibri"/>
+        </w:rPr>
+        <w:t>fossil_fuel_consumption</w:t>
+      </w:r>
+      <w:proofErr w:type="spellEnd"/>
+      <w:r>
+        <w:rPr>
+          <w:rFonts w:ascii="Calibri" w:hAnsi="Calibri" w:cs="Calibri"/>
+        </w:rPr>
+        <w:t xml:space="preserve"> integer,</w:t>
+      </w:r>
+    </w:p>
+    <w:p>
+      <w:pPr>
+        <w:pStyle w:val="NoSpacing"/>
+        <w:rPr>
+          <w:rFonts w:ascii="Calibri" w:hAnsi="Calibri" w:cs="Calibri"/>
+        </w:rPr>
+      </w:pPr>
+      <w:r>
+        <w:rPr>
+          <w:rFonts w:ascii="Calibri" w:hAnsi="Calibri" w:cs="Calibri"/>
+        </w:rPr>
+        <w:t xml:space="preserve">    </w:t>
+      </w:r>
+      <w:proofErr w:type="spellStart"/>
+      <w:r>
+        <w:rPr>
+          <w:rFonts w:ascii="Calibri" w:hAnsi="Calibri" w:cs="Calibri"/>
+        </w:rPr>
+        <w:t>gas_consumption</w:t>
+      </w:r>
+      <w:proofErr w:type="spellEnd"/>
+      <w:r>
+        <w:rPr>
+          <w:rFonts w:ascii="Calibri" w:hAnsi="Calibri" w:cs="Calibri"/>
+        </w:rPr>
+        <w:t xml:space="preserve"> integer,</w:t>
+      </w:r>
+    </w:p>
+    <w:p>
+      <w:pPr>
+        <w:pStyle w:val="NoSpacing"/>
+        <w:rPr>
+          <w:rFonts w:ascii="Calibri" w:hAnsi="Calibri" w:cs="Calibri"/>
+        </w:rPr>
+      </w:pPr>
+      <w:r>
+        <w:rPr>
+          <w:rFonts w:ascii="Calibri" w:hAnsi="Calibri" w:cs="Calibri"/>
+        </w:rPr>
+        <w:t xml:space="preserve">    </w:t>
+      </w:r>
+      <w:proofErr w:type="spellStart"/>
+      <w:r>
+        <w:rPr>
+          <w:rFonts w:ascii="Calibri" w:hAnsi="Calibri" w:cs="Calibri"/>
+        </w:rPr>
+        <w:t>gas_production</w:t>
+      </w:r>
+      <w:proofErr w:type="spellEnd"/>
+      <w:r>
+        <w:rPr>
+          <w:rFonts w:ascii="Calibri" w:hAnsi="Calibri" w:cs="Calibri"/>
+        </w:rPr>
+        <w:t xml:space="preserve"> integer,</w:t>
+      </w:r>
+    </w:p>
+    <w:p>
+      <w:pPr>
+        <w:pStyle w:val="NoSpacing"/>
+        <w:rPr>
+          <w:rFonts w:ascii="Calibri" w:hAnsi="Calibri" w:cs="Calibri"/>
+        </w:rPr>
+      </w:pPr>
+      <w:r>
+        <w:rPr>
+          <w:rFonts w:ascii="Calibri" w:hAnsi="Calibri" w:cs="Calibri"/>
+        </w:rPr>
+        <w:t xml:space="preserve">    </w:t>
+      </w:r>
+      <w:proofErr w:type="spellStart"/>
+      <w:r>
+        <w:rPr>
+          <w:rFonts w:ascii="Calibri" w:hAnsi="Calibri" w:cs="Calibri"/>
+        </w:rPr>
+        <w:t>hydro_consumption</w:t>
+      </w:r>
+      <w:proofErr w:type="spellEnd"/>
+      <w:r>
+        <w:rPr>
+          <w:rFonts w:ascii="Calibri" w:hAnsi="Calibri" w:cs="Calibri"/>
+        </w:rPr>
+        <w:t xml:space="preserve"> integer,</w:t>
+      </w:r>
+    </w:p>
+    <w:p>
+      <w:pPr>
+        <w:pStyle w:val="NoSpacing"/>
+        <w:rPr>
+          <w:rFonts w:ascii="Calibri" w:hAnsi="Calibri" w:cs="Calibri"/>
+        </w:rPr>
+      </w:pPr>
+      <w:r>
+        <w:rPr>
+          <w:rFonts w:ascii="Calibri" w:hAnsi="Calibri" w:cs="Calibri"/>
+        </w:rPr>
+        <w:t xml:space="preserve">    </w:t>
+      </w:r>
+      <w:proofErr w:type="spellStart"/>
+      <w:r>
+        <w:rPr>
+          <w:rFonts w:ascii="Calibri" w:hAnsi="Calibri" w:cs="Calibri"/>
+        </w:rPr>
+        <w:t>low_carbon_consumption</w:t>
+      </w:r>
+      <w:proofErr w:type="spellEnd"/>
+      <w:r>
+        <w:rPr>
+          <w:rFonts w:ascii="Calibri" w:hAnsi="Calibri" w:cs="Calibri"/>
+        </w:rPr>
+        <w:t xml:space="preserve"> integer,</w:t>
+      </w:r>
+    </w:p>
+    <w:p>
+      <w:pPr>
+        <w:pStyle w:val="NoSpacing"/>
+        <w:rPr>
+          <w:rFonts w:ascii="Calibri" w:hAnsi="Calibri" w:cs="Calibri"/>
+        </w:rPr>
+      </w:pPr>
+      <w:r>
+        <w:rPr>
+          <w:rFonts w:ascii="Calibri" w:hAnsi="Calibri" w:cs="Calibri"/>
+        </w:rPr>
+        <w:t xml:space="preserve">    </w:t>
+      </w:r>
+      <w:proofErr w:type="spellStart"/>
+      <w:r>
+        <w:rPr>
+          <w:rFonts w:ascii="Calibri" w:hAnsi="Calibri" w:cs="Calibri"/>
+        </w:rPr>
+        <w:t>nuclear_consumption</w:t>
+      </w:r>
+      <w:proofErr w:type="spellEnd"/>
+      <w:r>
+        <w:rPr>
+          <w:rFonts w:ascii="Calibri" w:hAnsi="Calibri" w:cs="Calibri"/>
+        </w:rPr>
+        <w:t xml:space="preserve"> integer,</w:t>
+      </w:r>
+    </w:p>
+    <w:p>
+      <w:pPr>
+        <w:pStyle w:val="NoSpacing"/>
+        <w:rPr>
+          <w:rFonts w:ascii="Calibri" w:hAnsi="Calibri" w:cs="Calibri"/>
+        </w:rPr>
+      </w:pPr>
+      <w:r>
+        <w:rPr>
+          <w:rFonts w:ascii="Calibri" w:hAnsi="Calibri" w:cs="Calibri"/>
+        </w:rPr>
+        <w:t xml:space="preserve">    </w:t>
+      </w:r>
+      <w:proofErr w:type="spellStart"/>
+      <w:r>
+        <w:rPr>
+          <w:rFonts w:ascii="Calibri" w:hAnsi="Calibri" w:cs="Calibri"/>
+        </w:rPr>
+        <w:t>oil_consumption</w:t>
+      </w:r>
+      <w:proofErr w:type="spellEnd"/>
+      <w:r>
+        <w:rPr>
+          <w:rFonts w:ascii="Calibri" w:hAnsi="Calibri" w:cs="Calibri"/>
+        </w:rPr>
+        <w:t xml:space="preserve"> integer,</w:t>
+      </w:r>
+    </w:p>
+    <w:p>
+      <w:pPr>
+        <w:pStyle w:val="NoSpacing"/>
+        <w:rPr>
+          <w:rFonts w:ascii="Calibri" w:hAnsi="Calibri" w:cs="Calibri"/>
+        </w:rPr>
+      </w:pPr>
+      <w:r>
+        <w:rPr>
+          <w:rFonts w:ascii="Calibri" w:hAnsi="Calibri" w:cs="Calibri"/>
+        </w:rPr>
+        <w:t xml:space="preserve">    </w:t>
+      </w:r>
+      <w:proofErr w:type="spellStart"/>
+      <w:r>
+        <w:rPr>
+          <w:rFonts w:ascii="Calibri" w:hAnsi="Calibri" w:cs="Calibri"/>
+        </w:rPr>
+        <w:t>oil_production</w:t>
+      </w:r>
+      <w:proofErr w:type="spellEnd"/>
+      <w:r>
+        <w:rPr>
+          <w:rFonts w:ascii="Calibri" w:hAnsi="Calibri" w:cs="Calibri"/>
+        </w:rPr>
+        <w:t xml:space="preserve"> integer,</w:t>
+      </w:r>
+    </w:p>
+    <w:p>
+      <w:pPr>
+        <w:pStyle w:val="NoSpacing"/>
+        <w:rPr>
+          <w:rFonts w:ascii="Calibri" w:hAnsi="Calibri" w:cs="Calibri"/>
+        </w:rPr>
+      </w:pPr>
+      <w:r>
+        <w:rPr>
+          <w:rFonts w:ascii="Calibri" w:hAnsi="Calibri" w:cs="Calibri"/>
+        </w:rPr>
+        <w:t xml:space="preserve">    </w:t>
+      </w:r>
+      <w:proofErr w:type="spellStart"/>
+      <w:r>
+        <w:rPr>
+          <w:rFonts w:ascii="Calibri" w:hAnsi="Calibri" w:cs="Calibri"/>
+        </w:rPr>
+        <w:t>other_renewables_cons_change_pct</w:t>
+      </w:r>
+      <w:proofErr w:type="spellEnd"/>
+      <w:r>
+        <w:rPr>
+          <w:rFonts w:ascii="Calibri" w:hAnsi="Calibri" w:cs="Calibri"/>
+        </w:rPr>
+        <w:t xml:space="preserve"> integer,</w:t>
+      </w:r>
+    </w:p>
+    <w:p>
+      <w:pPr>
+        <w:pStyle w:val="NoSpacing"/>
+        <w:rPr>
+          <w:rFonts w:ascii="Calibri" w:hAnsi="Calibri" w:cs="Calibri"/>
+        </w:rPr>
+      </w:pPr>
+      <w:r>
+        <w:rPr>
+          <w:rFonts w:ascii="Calibri" w:hAnsi="Calibri" w:cs="Calibri"/>
+        </w:rPr>
+        <w:t xml:space="preserve">    </w:t>
+      </w:r>
+      <w:proofErr w:type="spellStart"/>
+      <w:r>
+        <w:rPr>
+          <w:rFonts w:ascii="Calibri" w:hAnsi="Calibri" w:cs="Calibri"/>
+        </w:rPr>
+        <w:t>other_renewables_share_energy</w:t>
+      </w:r>
+      <w:proofErr w:type="spellEnd"/>
+      <w:r>
+        <w:rPr>
+          <w:rFonts w:ascii="Calibri" w:hAnsi="Calibri" w:cs="Calibri"/>
+        </w:rPr>
+        <w:t xml:space="preserve"> integer,</w:t>
+      </w:r>
+    </w:p>
+    <w:p>
+      <w:pPr>
+        <w:pStyle w:val="NoSpacing"/>
+        <w:rPr>
+          <w:rFonts w:ascii="Calibri" w:hAnsi="Calibri" w:cs="Calibri"/>
+        </w:rPr>
+      </w:pPr>
+      <w:r>
+        <w:rPr>
+          <w:rFonts w:ascii="Calibri" w:hAnsi="Calibri" w:cs="Calibri"/>
+        </w:rPr>
+        <w:t xml:space="preserve">    </w:t>
+      </w:r>
+      <w:proofErr w:type="spellStart"/>
+      <w:r>
+        <w:rPr>
+          <w:rFonts w:ascii="Calibri" w:hAnsi="Calibri" w:cs="Calibri"/>
+        </w:rPr>
+        <w:t>other_renewables_cons_change_twh</w:t>
+      </w:r>
+      <w:proofErr w:type="spellEnd"/>
+      <w:r>
+        <w:rPr>
+          <w:rFonts w:ascii="Calibri" w:hAnsi="Calibri" w:cs="Calibri"/>
+        </w:rPr>
+        <w:t xml:space="preserve"> integer,</w:t>
+      </w:r>
+    </w:p>
+    <w:p>
+      <w:pPr>
+        <w:pStyle w:val="NoSpacing"/>
+        <w:rPr>
+          <w:rFonts w:ascii="Calibri" w:hAnsi="Calibri" w:cs="Calibri"/>
+        </w:rPr>
+      </w:pPr>
+      <w:r>
+        <w:rPr>
+          <w:rFonts w:ascii="Calibri" w:hAnsi="Calibri" w:cs="Calibri"/>
+        </w:rPr>
+        <w:t xml:space="preserve">    </w:t>
+      </w:r>
+      <w:proofErr w:type="spellStart"/>
+      <w:r>
+        <w:rPr>
+          <w:rFonts w:ascii="Calibri" w:hAnsi="Calibri" w:cs="Calibri"/>
+        </w:rPr>
+        <w:t>other_renewable_consumption</w:t>
+      </w:r>
+      <w:proofErr w:type="spellEnd"/>
+      <w:r>
+        <w:rPr>
+          <w:rFonts w:ascii="Calibri" w:hAnsi="Calibri" w:cs="Calibri"/>
+        </w:rPr>
+        <w:t xml:space="preserve"> integer,</w:t>
+      </w:r>
+    </w:p>
+    <w:p>
+      <w:pPr>
+        <w:pStyle w:val="NoSpacing"/>
+        <w:rPr>
+          <w:rFonts w:ascii="Calibri" w:hAnsi="Calibri" w:cs="Calibri"/>
+        </w:rPr>
+      </w:pPr>
+      <w:r>
+        <w:rPr>
+          <w:rFonts w:ascii="Calibri" w:hAnsi="Calibri" w:cs="Calibri"/>
+        </w:rPr>
+        <w:t xml:space="preserve">    </w:t>
+      </w:r>
+      <w:proofErr w:type="spellStart"/>
+      <w:r>
+        <w:rPr>
+          <w:rFonts w:ascii="Calibri" w:hAnsi="Calibri" w:cs="Calibri"/>
+        </w:rPr>
+        <w:t>other_renewables_share_elec</w:t>
+      </w:r>
+      <w:proofErr w:type="spellEnd"/>
+      <w:r>
+        <w:rPr>
+          <w:rFonts w:ascii="Calibri" w:hAnsi="Calibri" w:cs="Calibri"/>
+        </w:rPr>
+        <w:t xml:space="preserve"> integer,</w:t>
+      </w:r>
+    </w:p>
+    <w:p>
+      <w:pPr>
+        <w:pStyle w:val="NoSpacing"/>
+        <w:rPr>
+          <w:rFonts w:ascii="Calibri" w:hAnsi="Calibri" w:cs="Calibri"/>
+        </w:rPr>
+      </w:pPr>
+      <w:r>
+        <w:rPr>
+          <w:rFonts w:ascii="Calibri" w:hAnsi="Calibri" w:cs="Calibri"/>
+        </w:rPr>
+        <w:t xml:space="preserve">    </w:t>
+      </w:r>
+      <w:proofErr w:type="spellStart"/>
+      <w:r>
+        <w:rPr>
+          <w:rFonts w:ascii="Calibri" w:hAnsi="Calibri" w:cs="Calibri"/>
+        </w:rPr>
+        <w:t>primary_energy_consumption</w:t>
+      </w:r>
+      <w:proofErr w:type="spellEnd"/>
+      <w:r>
+        <w:rPr>
+          <w:rFonts w:ascii="Calibri" w:hAnsi="Calibri" w:cs="Calibri"/>
+        </w:rPr>
+        <w:t xml:space="preserve"> integer,</w:t>
+      </w:r>
+    </w:p>
+    <w:p>
+      <w:pPr>
+        <w:pStyle w:val="NoSpacing"/>
+        <w:rPr>
+          <w:rFonts w:ascii="Calibri" w:hAnsi="Calibri" w:cs="Calibri"/>
+        </w:rPr>
+      </w:pPr>
+      <w:r>
+        <w:rPr>
+          <w:rFonts w:ascii="Calibri" w:hAnsi="Calibri" w:cs="Calibri"/>
+        </w:rPr>
+        <w:t xml:space="preserve">    </w:t>
+      </w:r>
+      <w:proofErr w:type="spellStart"/>
+      <w:r>
+        <w:rPr>
+          <w:rFonts w:ascii="Calibri" w:hAnsi="Calibri" w:cs="Calibri"/>
+        </w:rPr>
+        <w:t>renewables_share_elec</w:t>
+      </w:r>
+      <w:proofErr w:type="spellEnd"/>
+      <w:r>
+        <w:rPr>
+          <w:rFonts w:ascii="Calibri" w:hAnsi="Calibri" w:cs="Calibri"/>
+        </w:rPr>
+        <w:t xml:space="preserve"> integer,</w:t>
+      </w:r>
+    </w:p>
+    <w:p>
+      <w:pPr>
+        <w:pStyle w:val="NoSpacing"/>
+        <w:rPr>
+          <w:rFonts w:ascii="Calibri" w:hAnsi="Calibri" w:cs="Calibri"/>
+        </w:rPr>
+      </w:pPr>
+      <w:r>
+        <w:rPr>
+          <w:rFonts w:ascii="Calibri" w:hAnsi="Calibri" w:cs="Calibri"/>
+        </w:rPr>
+        <w:t xml:space="preserve">    </w:t>
+      </w:r>
+      <w:proofErr w:type="spellStart"/>
+      <w:r>
+        <w:rPr>
+          <w:rFonts w:ascii="Calibri" w:hAnsi="Calibri" w:cs="Calibri"/>
+        </w:rPr>
+        <w:t>renewables_share_energy</w:t>
+      </w:r>
+      <w:proofErr w:type="spellEnd"/>
+      <w:r>
+        <w:rPr>
+          <w:rFonts w:ascii="Calibri" w:hAnsi="Calibri" w:cs="Calibri"/>
+        </w:rPr>
+        <w:t xml:space="preserve"> integer,</w:t>
+      </w:r>
+    </w:p>
+    <w:p>
+      <w:pPr>
+        <w:pStyle w:val="NoSpacing"/>
+        <w:rPr>
+          <w:rFonts w:ascii="Calibri" w:hAnsi="Calibri" w:cs="Calibri"/>
+        </w:rPr>
+      </w:pPr>
+      <w:r>
+        <w:rPr>
+          <w:rFonts w:ascii="Calibri" w:hAnsi="Calibri" w:cs="Calibri"/>
+        </w:rPr>
+        <w:t xml:space="preserve">    </w:t>
+      </w:r>
+      <w:proofErr w:type="spellStart"/>
+      <w:r>
+        <w:rPr>
+          <w:rFonts w:ascii="Calibri" w:hAnsi="Calibri" w:cs="Calibri"/>
+        </w:rPr>
+        <w:t>renewables_consumption</w:t>
+      </w:r>
+      <w:proofErr w:type="spellEnd"/>
+      <w:r>
+        <w:rPr>
+          <w:rFonts w:ascii="Calibri" w:hAnsi="Calibri" w:cs="Calibri"/>
+        </w:rPr>
+        <w:t xml:space="preserve"> integer,</w:t>
       </w:r>
     </w:p>
     <w:p>
@@ -971,77 +1636,161 @@
           <w:rFonts w:ascii="Calibri" w:hAnsi="Calibri" w:cs="Calibri"/>
         </w:rPr>
         <w:lastRenderedPageBreak/>
-        <w:t xml:space="preserve">    solar_share_elec integer,</w:t>
-      </w:r>
-    </w:p>
-    <w:p>
-      <w:pPr>
-        <w:pStyle w:val="NoSpacing"/>
-        <w:rPr>
-          <w:rFonts w:ascii="Calibri" w:hAnsi="Calibri" w:cs="Calibri"/>
-        </w:rPr>
-      </w:pPr>
-      <w:r>
-        <w:rPr>
-          <w:rFonts w:ascii="Calibri" w:hAnsi="Calibri" w:cs="Calibri"/>
-        </w:rPr>
-        <w:t xml:space="preserve">    solar_share_energy integer,</w:t>
-      </w:r>
-    </w:p>
-    <w:p>
-      <w:pPr>
-        <w:pStyle w:val="NoSpacing"/>
-        <w:rPr>
-          <w:rFonts w:ascii="Calibri" w:hAnsi="Calibri" w:cs="Calibri"/>
-        </w:rPr>
-      </w:pPr>
-      <w:r>
-        <w:rPr>
-          <w:rFonts w:ascii="Calibri" w:hAnsi="Calibri" w:cs="Calibri"/>
-        </w:rPr>
-        <w:t xml:space="preserve">    solar_consumption integer,</w:t>
-      </w:r>
-    </w:p>
-    <w:p>
-      <w:pPr>
-        <w:pStyle w:val="NoSpacing"/>
-        <w:rPr>
-          <w:rFonts w:ascii="Calibri" w:hAnsi="Calibri" w:cs="Calibri"/>
-        </w:rPr>
-      </w:pPr>
-      <w:r>
-        <w:rPr>
-          <w:rFonts w:ascii="Calibri" w:hAnsi="Calibri" w:cs="Calibri"/>
-        </w:rPr>
-        <w:t xml:space="preserve">    wind_share_elec integer,</w:t>
-      </w:r>
-    </w:p>
-    <w:p>
-      <w:pPr>
-        <w:pStyle w:val="NoSpacing"/>
-        <w:rPr>
-          <w:rFonts w:ascii="Calibri" w:hAnsi="Calibri" w:cs="Calibri"/>
-        </w:rPr>
-      </w:pPr>
-      <w:r>
-        <w:rPr>
-          <w:rFonts w:ascii="Calibri" w:hAnsi="Calibri" w:cs="Calibri"/>
-        </w:rPr>
-        <w:t xml:space="preserve">    wind_share_energy integer,</w:t>
-      </w:r>
-    </w:p>
-    <w:p>
-      <w:pPr>
-        <w:pStyle w:val="NoSpacing"/>
-        <w:rPr>
-          <w:rFonts w:ascii="Calibri" w:hAnsi="Calibri" w:cs="Calibri"/>
-        </w:rPr>
-      </w:pPr>
-      <w:r>
-        <w:rPr>
-          <w:rFonts w:ascii="Calibri" w:hAnsi="Calibri" w:cs="Calibri"/>
-        </w:rPr>
-        <w:t xml:space="preserve">    wind_consumption integer</w:t>
+        <w:t xml:space="preserve">    </w:t>
+      </w:r>
+      <w:proofErr w:type="spellStart"/>
+      <w:r>
+        <w:rPr>
+          <w:rFonts w:ascii="Calibri" w:hAnsi="Calibri" w:cs="Calibri"/>
+        </w:rPr>
+        <w:t>solar_share_elec</w:t>
+      </w:r>
+      <w:proofErr w:type="spellEnd"/>
+      <w:r>
+        <w:rPr>
+          <w:rFonts w:ascii="Calibri" w:hAnsi="Calibri" w:cs="Calibri"/>
+        </w:rPr>
+        <w:t xml:space="preserve"> integer,</w:t>
+      </w:r>
+    </w:p>
+    <w:p>
+      <w:pPr>
+        <w:pStyle w:val="NoSpacing"/>
+        <w:rPr>
+          <w:rFonts w:ascii="Calibri" w:hAnsi="Calibri" w:cs="Calibri"/>
+        </w:rPr>
+      </w:pPr>
+      <w:r>
+        <w:rPr>
+          <w:rFonts w:ascii="Calibri" w:hAnsi="Calibri" w:cs="Calibri"/>
+        </w:rPr>
+        <w:t xml:space="preserve">    </w:t>
+      </w:r>
+      <w:proofErr w:type="spellStart"/>
+      <w:r>
+        <w:rPr>
+          <w:rFonts w:ascii="Calibri" w:hAnsi="Calibri" w:cs="Calibri"/>
+        </w:rPr>
+        <w:t>solar_share_energy</w:t>
+      </w:r>
+      <w:proofErr w:type="spellEnd"/>
+      <w:r>
+        <w:rPr>
+          <w:rFonts w:ascii="Calibri" w:hAnsi="Calibri" w:cs="Calibri"/>
+        </w:rPr>
+        <w:t xml:space="preserve"> integer,</w:t>
+      </w:r>
+    </w:p>
+    <w:p>
+      <w:pPr>
+        <w:pStyle w:val="NoSpacing"/>
+        <w:rPr>
+          <w:rFonts w:ascii="Calibri" w:hAnsi="Calibri" w:cs="Calibri"/>
+        </w:rPr>
+      </w:pPr>
+      <w:r>
+        <w:rPr>
+          <w:rFonts w:ascii="Calibri" w:hAnsi="Calibri" w:cs="Calibri"/>
+        </w:rPr>
+        <w:t xml:space="preserve">    </w:t>
+      </w:r>
+      <w:proofErr w:type="spellStart"/>
+      <w:r>
+        <w:rPr>
+          <w:rFonts w:ascii="Calibri" w:hAnsi="Calibri" w:cs="Calibri"/>
+        </w:rPr>
+        <w:t>solar_consumption</w:t>
+      </w:r>
+      <w:proofErr w:type="spellEnd"/>
+      <w:r>
+        <w:rPr>
+          <w:rFonts w:ascii="Calibri" w:hAnsi="Calibri" w:cs="Calibri"/>
+        </w:rPr>
+        <w:t xml:space="preserve"> integer,</w:t>
+      </w:r>
+    </w:p>
+    <w:p>
+      <w:pPr>
+        <w:pStyle w:val="NoSpacing"/>
+        <w:rPr>
+          <w:rFonts w:ascii="Calibri" w:hAnsi="Calibri" w:cs="Calibri"/>
+        </w:rPr>
+      </w:pPr>
+      <w:r>
+        <w:rPr>
+          <w:rFonts w:ascii="Calibri" w:hAnsi="Calibri" w:cs="Calibri"/>
+        </w:rPr>
+        <w:t xml:space="preserve">    </w:t>
+      </w:r>
+      <w:proofErr w:type="spellStart"/>
+      <w:r>
+        <w:rPr>
+          <w:rFonts w:ascii="Calibri" w:hAnsi="Calibri" w:cs="Calibri"/>
+        </w:rPr>
+        <w:t>wind_share_elec</w:t>
+      </w:r>
+      <w:proofErr w:type="spellEnd"/>
+      <w:r>
+        <w:rPr>
+          <w:rFonts w:ascii="Calibri" w:hAnsi="Calibri" w:cs="Calibri"/>
+        </w:rPr>
+        <w:t xml:space="preserve"> integer,</w:t>
+      </w:r>
+    </w:p>
+    <w:p>
+      <w:pPr>
+        <w:pStyle w:val="NoSpacing"/>
+        <w:rPr>
+          <w:rFonts w:ascii="Calibri" w:hAnsi="Calibri" w:cs="Calibri"/>
+        </w:rPr>
+      </w:pPr>
+      <w:r>
+        <w:rPr>
+          <w:rFonts w:ascii="Calibri" w:hAnsi="Calibri" w:cs="Calibri"/>
+        </w:rPr>
+        <w:t xml:space="preserve">    </w:t>
+      </w:r>
+      <w:proofErr w:type="spellStart"/>
+      <w:r>
+        <w:rPr>
+          <w:rFonts w:ascii="Calibri" w:hAnsi="Calibri" w:cs="Calibri"/>
+        </w:rPr>
+        <w:t>wind_share_energy</w:t>
+      </w:r>
+      <w:proofErr w:type="spellEnd"/>
+      <w:r>
+        <w:rPr>
+          <w:rFonts w:ascii="Calibri" w:hAnsi="Calibri" w:cs="Calibri"/>
+        </w:rPr>
+        <w:t xml:space="preserve"> integer,</w:t>
+      </w:r>
+    </w:p>
+    <w:p>
+      <w:pPr>
+        <w:pStyle w:val="NoSpacing"/>
+        <w:rPr>
+          <w:rFonts w:ascii="Calibri" w:hAnsi="Calibri" w:cs="Calibri"/>
+        </w:rPr>
+      </w:pPr>
+      <w:r>
+        <w:rPr>
+          <w:rFonts w:ascii="Calibri" w:hAnsi="Calibri" w:cs="Calibri"/>
+        </w:rPr>
+        <w:t xml:space="preserve">    </w:t>
+      </w:r>
+      <w:proofErr w:type="spellStart"/>
+      <w:r>
+        <w:rPr>
+          <w:rFonts w:ascii="Calibri" w:hAnsi="Calibri" w:cs="Calibri"/>
+        </w:rPr>
+        <w:t>wind_consumption</w:t>
+      </w:r>
+      <w:proofErr w:type="spellEnd"/>
+      <w:r>
+        <w:rPr>
+          <w:rFonts w:ascii="Calibri" w:hAnsi="Calibri" w:cs="Calibri"/>
+        </w:rPr>
+        <w:t xml:space="preserve"> integer</w:t>
       </w:r>
       <w:r>
         <w:rPr>
@@ -1115,110 +1864,176 @@
         <w:rPr>
           <w:rFonts w:ascii="Calibri" w:hAnsi="Calibri" w:cs="Calibri"/>
         </w:rPr>
-        <w:t>TABLESPACE pg_default;</w:t>
-      </w:r>
-    </w:p>
-    <w:p>
-      <w:pPr>
-        <w:pStyle w:val="NoSpacing"/>
-        <w:rPr>
-          <w:rFonts w:ascii="Calibri" w:hAnsi="Calibri" w:cs="Calibri"/>
-        </w:rPr>
-      </w:pPr>
-    </w:p>
-    <w:p>
-      <w:pPr>
-        <w:pStyle w:val="NoSpacing"/>
-        <w:rPr>
-          <w:rFonts w:ascii="Calibri" w:hAnsi="Calibri" w:cs="Calibri"/>
-        </w:rPr>
-      </w:pPr>
-      <w:r>
-        <w:rPr>
-          <w:rFonts w:ascii="Calibri" w:hAnsi="Calibri" w:cs="Calibri"/>
-        </w:rPr>
-        <w:t>ALTER TABLE IF EXISTS public.allcountryenergy</w:t>
-      </w:r>
-    </w:p>
-    <w:p>
-      <w:pPr>
-        <w:pStyle w:val="NoSpacing"/>
-        <w:rPr>
-          <w:rFonts w:ascii="Calibri" w:hAnsi="Calibri" w:cs="Calibri"/>
-        </w:rPr>
-      </w:pPr>
-      <w:r>
-        <w:rPr>
-          <w:rFonts w:ascii="Calibri" w:hAnsi="Calibri" w:cs="Calibri"/>
-        </w:rPr>
-        <w:t xml:space="preserve">    OWNER to postgres;</w:t>
-      </w:r>
-    </w:p>
-    <w:p>
-      <w:pPr>
-        <w:pStyle w:val="NoSpacing"/>
-        <w:rPr>
-          <w:rFonts w:ascii="Calibri" w:hAnsi="Calibri" w:cs="Calibri"/>
-        </w:rPr>
-      </w:pPr>
-    </w:p>
-    <w:p>
-      <w:pPr>
-        <w:pStyle w:val="NoSpacing"/>
-        <w:rPr>
-          <w:rFonts w:ascii="Calibri" w:hAnsi="Calibri" w:cs="Calibri"/>
-        </w:rPr>
-      </w:pPr>
-      <w:r>
-        <w:rPr>
-          <w:rFonts w:ascii="Calibri" w:hAnsi="Calibri" w:cs="Calibri"/>
-        </w:rPr>
-        <w:t>-- Table: public.worldconsumption</w:t>
-      </w:r>
-    </w:p>
-    <w:p>
-      <w:pPr>
-        <w:pStyle w:val="NoSpacing"/>
-        <w:rPr>
-          <w:rFonts w:ascii="Calibri" w:hAnsi="Calibri" w:cs="Calibri"/>
-        </w:rPr>
-      </w:pPr>
-    </w:p>
-    <w:p>
-      <w:pPr>
-        <w:pStyle w:val="NoSpacing"/>
-        <w:rPr>
-          <w:rFonts w:ascii="Calibri" w:hAnsi="Calibri" w:cs="Calibri"/>
-        </w:rPr>
-      </w:pPr>
-      <w:r>
-        <w:rPr>
-          <w:rFonts w:ascii="Calibri" w:hAnsi="Calibri" w:cs="Calibri"/>
-        </w:rPr>
-        <w:t>-- DROP TABLE IF EXISTS public.worldconsumption;</w:t>
-      </w:r>
-    </w:p>
-    <w:p>
-      <w:pPr>
-        <w:pStyle w:val="NoSpacing"/>
-        <w:rPr>
-          <w:rFonts w:ascii="Calibri" w:hAnsi="Calibri" w:cs="Calibri"/>
-        </w:rPr>
-      </w:pPr>
-    </w:p>
-    <w:p>
-      <w:pPr>
-        <w:pStyle w:val="NoSpacing"/>
-        <w:rPr>
-          <w:rFonts w:ascii="Calibri" w:hAnsi="Calibri" w:cs="Calibri"/>
-        </w:rPr>
-      </w:pPr>
-      <w:r>
-        <w:rPr>
-          <w:rFonts w:ascii="Calibri" w:hAnsi="Calibri" w:cs="Calibri"/>
-        </w:rPr>
-        <w:t>CREATE TABLE IF NOT EXISTS public.worldconsumption</w:t>
-      </w:r>
+        <w:t xml:space="preserve">TABLESPACE </w:t>
+      </w:r>
+      <w:proofErr w:type="spellStart"/>
+      <w:r>
+        <w:rPr>
+          <w:rFonts w:ascii="Calibri" w:hAnsi="Calibri" w:cs="Calibri"/>
+        </w:rPr>
+        <w:t>pg_default</w:t>
+      </w:r>
+      <w:proofErr w:type="spellEnd"/>
+      <w:r>
+        <w:rPr>
+          <w:rFonts w:ascii="Calibri" w:hAnsi="Calibri" w:cs="Calibri"/>
+        </w:rPr>
+        <w:t>;</w:t>
+      </w:r>
+    </w:p>
+    <w:p>
+      <w:pPr>
+        <w:pStyle w:val="NoSpacing"/>
+        <w:rPr>
+          <w:rFonts w:ascii="Calibri" w:hAnsi="Calibri" w:cs="Calibri"/>
+        </w:rPr>
+      </w:pPr>
+    </w:p>
+    <w:p>
+      <w:pPr>
+        <w:pStyle w:val="NoSpacing"/>
+        <w:rPr>
+          <w:rFonts w:ascii="Calibri" w:hAnsi="Calibri" w:cs="Calibri"/>
+        </w:rPr>
+      </w:pPr>
+      <w:r>
+        <w:rPr>
+          <w:rFonts w:ascii="Calibri" w:hAnsi="Calibri" w:cs="Calibri"/>
+        </w:rPr>
+        <w:t xml:space="preserve">ALTER TABLE IF EXISTS </w:t>
+      </w:r>
+      <w:proofErr w:type="spellStart"/>
+      <w:r>
+        <w:rPr>
+          <w:rFonts w:ascii="Calibri" w:hAnsi="Calibri" w:cs="Calibri"/>
+        </w:rPr>
+        <w:t>public.allcountryenergy</w:t>
+      </w:r>
+      <w:proofErr w:type="spellEnd"/>
+    </w:p>
+    <w:p>
+      <w:pPr>
+        <w:pStyle w:val="NoSpacing"/>
+        <w:rPr>
+          <w:rFonts w:ascii="Calibri" w:hAnsi="Calibri" w:cs="Calibri"/>
+        </w:rPr>
+      </w:pPr>
+      <w:r>
+        <w:rPr>
+          <w:rFonts w:ascii="Calibri" w:hAnsi="Calibri" w:cs="Calibri"/>
+        </w:rPr>
+        <w:t xml:space="preserve">    OWNER to </w:t>
+      </w:r>
+      <w:proofErr w:type="spellStart"/>
+      <w:r>
+        <w:rPr>
+          <w:rFonts w:ascii="Calibri" w:hAnsi="Calibri" w:cs="Calibri"/>
+        </w:rPr>
+        <w:t>postgres</w:t>
+      </w:r>
+      <w:proofErr w:type="spellEnd"/>
+      <w:r>
+        <w:rPr>
+          <w:rFonts w:ascii="Calibri" w:hAnsi="Calibri" w:cs="Calibri"/>
+        </w:rPr>
+        <w:t>;</w:t>
+      </w:r>
+    </w:p>
+    <w:p>
+      <w:pPr>
+        <w:pStyle w:val="NoSpacing"/>
+        <w:rPr>
+          <w:rFonts w:ascii="Calibri" w:hAnsi="Calibri" w:cs="Calibri"/>
+        </w:rPr>
+      </w:pPr>
+    </w:p>
+    <w:p>
+      <w:pPr>
+        <w:pStyle w:val="NoSpacing"/>
+        <w:rPr>
+          <w:rFonts w:ascii="Calibri" w:hAnsi="Calibri" w:cs="Calibri"/>
+        </w:rPr>
+      </w:pPr>
+      <w:r>
+        <w:rPr>
+          <w:rFonts w:ascii="Calibri" w:hAnsi="Calibri" w:cs="Calibri"/>
+        </w:rPr>
+        <w:t xml:space="preserve">-- Table: </w:t>
+      </w:r>
+      <w:proofErr w:type="spellStart"/>
+      <w:r>
+        <w:rPr>
+          <w:rFonts w:ascii="Calibri" w:hAnsi="Calibri" w:cs="Calibri"/>
+        </w:rPr>
+        <w:t>public.worldconsumption</w:t>
+      </w:r>
+      <w:proofErr w:type="spellEnd"/>
+    </w:p>
+    <w:p>
+      <w:pPr>
+        <w:pStyle w:val="NoSpacing"/>
+        <w:rPr>
+          <w:rFonts w:ascii="Calibri" w:hAnsi="Calibri" w:cs="Calibri"/>
+        </w:rPr>
+      </w:pPr>
+    </w:p>
+    <w:p>
+      <w:pPr>
+        <w:pStyle w:val="NoSpacing"/>
+        <w:rPr>
+          <w:rFonts w:ascii="Calibri" w:hAnsi="Calibri" w:cs="Calibri"/>
+        </w:rPr>
+      </w:pPr>
+      <w:r>
+        <w:rPr>
+          <w:rFonts w:ascii="Calibri" w:hAnsi="Calibri" w:cs="Calibri"/>
+        </w:rPr>
+        <w:t xml:space="preserve">-- DROP TABLE IF EXISTS </w:t>
+      </w:r>
+      <w:proofErr w:type="spellStart"/>
+      <w:r>
+        <w:rPr>
+          <w:rFonts w:ascii="Calibri" w:hAnsi="Calibri" w:cs="Calibri"/>
+        </w:rPr>
+        <w:t>public.worldconsumption</w:t>
+      </w:r>
+      <w:proofErr w:type="spellEnd"/>
+      <w:r>
+        <w:rPr>
+          <w:rFonts w:ascii="Calibri" w:hAnsi="Calibri" w:cs="Calibri"/>
+        </w:rPr>
+        <w:t>;</w:t>
+      </w:r>
+    </w:p>
+    <w:p>
+      <w:pPr>
+        <w:pStyle w:val="NoSpacing"/>
+        <w:rPr>
+          <w:rFonts w:ascii="Calibri" w:hAnsi="Calibri" w:cs="Calibri"/>
+        </w:rPr>
+      </w:pPr>
+    </w:p>
+    <w:p>
+      <w:pPr>
+        <w:pStyle w:val="NoSpacing"/>
+        <w:rPr>
+          <w:rFonts w:ascii="Calibri" w:hAnsi="Calibri" w:cs="Calibri"/>
+        </w:rPr>
+      </w:pPr>
+      <w:r>
+        <w:rPr>
+          <w:rFonts w:ascii="Calibri" w:hAnsi="Calibri" w:cs="Calibri"/>
+        </w:rPr>
+        <w:t xml:space="preserve">CREATE TABLE IF NOT EXISTS </w:t>
+      </w:r>
+      <w:proofErr w:type="spellStart"/>
+      <w:r>
+        <w:rPr>
+          <w:rFonts w:ascii="Calibri" w:hAnsi="Calibri" w:cs="Calibri"/>
+        </w:rPr>
+        <w:t>public.worldconsumption</w:t>
+      </w:r>
+      <w:proofErr w:type="spellEnd"/>
     </w:p>
     <w:p>
       <w:pPr>
@@ -1245,35 +2060,77 @@
         <w:rPr>
           <w:rFonts w:ascii="Calibri" w:hAnsi="Calibri" w:cs="Calibri"/>
         </w:rPr>
-        <w:t xml:space="preserve">    "Continent" text COLLATE pg_catalog."default",</w:t>
-      </w:r>
-    </w:p>
-    <w:p>
-      <w:pPr>
-        <w:pStyle w:val="NoSpacing"/>
-        <w:rPr>
-          <w:rFonts w:ascii="Calibri" w:hAnsi="Calibri" w:cs="Calibri"/>
-        </w:rPr>
-      </w:pPr>
-      <w:r>
-        <w:rPr>
-          <w:rFonts w:ascii="Calibri" w:hAnsi="Calibri" w:cs="Calibri"/>
-        </w:rPr>
-        <w:t xml:space="preserve">    "Country" text COLLATE pg_catalog."default",</w:t>
-      </w:r>
-    </w:p>
-    <w:p>
-      <w:pPr>
-        <w:pStyle w:val="NoSpacing"/>
-        <w:rPr>
-          <w:rFonts w:ascii="Calibri" w:hAnsi="Calibri" w:cs="Calibri"/>
-        </w:rPr>
-      </w:pPr>
-      <w:r>
-        <w:rPr>
-          <w:rFonts w:ascii="Calibri" w:hAnsi="Calibri" w:cs="Calibri"/>
-        </w:rPr>
-        <w:t xml:space="preserve">    "Energy" text COLLATE pg_catalog."default",</w:t>
+        <w:t xml:space="preserve">    "Continent" text COLLATE </w:t>
+      </w:r>
+      <w:proofErr w:type="spellStart"/>
+      <w:r>
+        <w:rPr>
+          <w:rFonts w:ascii="Calibri" w:hAnsi="Calibri" w:cs="Calibri"/>
+        </w:rPr>
+        <w:t>pg_catalog."default</w:t>
+      </w:r>
+      <w:proofErr w:type="spellEnd"/>
+      <w:r>
+        <w:rPr>
+          <w:rFonts w:ascii="Calibri" w:hAnsi="Calibri" w:cs="Calibri"/>
+        </w:rPr>
+        <w:t>",</w:t>
+      </w:r>
+    </w:p>
+    <w:p>
+      <w:pPr>
+        <w:pStyle w:val="NoSpacing"/>
+        <w:rPr>
+          <w:rFonts w:ascii="Calibri" w:hAnsi="Calibri" w:cs="Calibri"/>
+        </w:rPr>
+      </w:pPr>
+      <w:r>
+        <w:rPr>
+          <w:rFonts w:ascii="Calibri" w:hAnsi="Calibri" w:cs="Calibri"/>
+        </w:rPr>
+        <w:t xml:space="preserve">    "Country" text COLLATE </w:t>
+      </w:r>
+      <w:proofErr w:type="spellStart"/>
+      <w:r>
+        <w:rPr>
+          <w:rFonts w:ascii="Calibri" w:hAnsi="Calibri" w:cs="Calibri"/>
+        </w:rPr>
+        <w:t>pg_catalog."default</w:t>
+      </w:r>
+      <w:proofErr w:type="spellEnd"/>
+      <w:r>
+        <w:rPr>
+          <w:rFonts w:ascii="Calibri" w:hAnsi="Calibri" w:cs="Calibri"/>
+        </w:rPr>
+        <w:t>",</w:t>
+      </w:r>
+    </w:p>
+    <w:p>
+      <w:pPr>
+        <w:pStyle w:val="NoSpacing"/>
+        <w:rPr>
+          <w:rFonts w:ascii="Calibri" w:hAnsi="Calibri" w:cs="Calibri"/>
+        </w:rPr>
+      </w:pPr>
+      <w:r>
+        <w:rPr>
+          <w:rFonts w:ascii="Calibri" w:hAnsi="Calibri" w:cs="Calibri"/>
+        </w:rPr>
+        <w:t xml:space="preserve">    "Energy" text COLLATE </w:t>
+      </w:r>
+      <w:proofErr w:type="spellStart"/>
+      <w:r>
+        <w:rPr>
+          <w:rFonts w:ascii="Calibri" w:hAnsi="Calibri" w:cs="Calibri"/>
+        </w:rPr>
+        <w:t>pg_catalog."default</w:t>
+      </w:r>
+      <w:proofErr w:type="spellEnd"/>
+      <w:r>
+        <w:rPr>
+          <w:rFonts w:ascii="Calibri" w:hAnsi="Calibri" w:cs="Calibri"/>
+        </w:rPr>
+        <w:t>",</w:t>
       </w:r>
     </w:p>
     <w:p>
@@ -1950,110 +2807,176 @@
         <w:rPr>
           <w:rFonts w:ascii="Calibri" w:hAnsi="Calibri" w:cs="Calibri"/>
         </w:rPr>
-        <w:t>TABLESPACE pg_default;</w:t>
-      </w:r>
-    </w:p>
-    <w:p>
-      <w:pPr>
-        <w:pStyle w:val="NoSpacing"/>
-        <w:rPr>
-          <w:rFonts w:ascii="Calibri" w:hAnsi="Calibri" w:cs="Calibri"/>
-        </w:rPr>
-      </w:pPr>
-    </w:p>
-    <w:p>
-      <w:pPr>
-        <w:pStyle w:val="NoSpacing"/>
-        <w:rPr>
-          <w:rFonts w:ascii="Calibri" w:hAnsi="Calibri" w:cs="Calibri"/>
-        </w:rPr>
-      </w:pPr>
-      <w:r>
-        <w:rPr>
-          <w:rFonts w:ascii="Calibri" w:hAnsi="Calibri" w:cs="Calibri"/>
-        </w:rPr>
-        <w:t>ALTER TABLE IF EXISTS public.worldconsumption</w:t>
-      </w:r>
-    </w:p>
-    <w:p>
-      <w:pPr>
-        <w:pStyle w:val="NoSpacing"/>
-        <w:rPr>
-          <w:rFonts w:ascii="Calibri" w:hAnsi="Calibri" w:cs="Calibri"/>
-        </w:rPr>
-      </w:pPr>
-      <w:r>
-        <w:rPr>
-          <w:rFonts w:ascii="Calibri" w:hAnsi="Calibri" w:cs="Calibri"/>
-        </w:rPr>
-        <w:t xml:space="preserve">    OWNER to postgres;</w:t>
-      </w:r>
-    </w:p>
-    <w:p>
-      <w:pPr>
-        <w:pStyle w:val="NoSpacing"/>
-        <w:rPr>
-          <w:rFonts w:ascii="Calibri" w:hAnsi="Calibri" w:cs="Calibri"/>
-        </w:rPr>
-      </w:pPr>
-    </w:p>
-    <w:p>
-      <w:pPr>
-        <w:pStyle w:val="NoSpacing"/>
-        <w:rPr>
-          <w:rFonts w:ascii="Calibri" w:hAnsi="Calibri" w:cs="Calibri"/>
-        </w:rPr>
-      </w:pPr>
-      <w:r>
-        <w:rPr>
-          <w:rFonts w:ascii="Calibri" w:hAnsi="Calibri" w:cs="Calibri"/>
-        </w:rPr>
-        <w:t>-- Table: public.worldproduction</w:t>
-      </w:r>
-    </w:p>
-    <w:p>
-      <w:pPr>
-        <w:pStyle w:val="NoSpacing"/>
-        <w:rPr>
-          <w:rFonts w:ascii="Calibri" w:hAnsi="Calibri" w:cs="Calibri"/>
-        </w:rPr>
-      </w:pPr>
-    </w:p>
-    <w:p>
-      <w:pPr>
-        <w:pStyle w:val="NoSpacing"/>
-        <w:rPr>
-          <w:rFonts w:ascii="Calibri" w:hAnsi="Calibri" w:cs="Calibri"/>
-        </w:rPr>
-      </w:pPr>
-      <w:r>
-        <w:rPr>
-          <w:rFonts w:ascii="Calibri" w:hAnsi="Calibri" w:cs="Calibri"/>
-        </w:rPr>
-        <w:t>-- DROP TABLE IF EXISTS public.worldproduction;</w:t>
-      </w:r>
-    </w:p>
-    <w:p>
-      <w:pPr>
-        <w:pStyle w:val="NoSpacing"/>
-        <w:rPr>
-          <w:rFonts w:ascii="Calibri" w:hAnsi="Calibri" w:cs="Calibri"/>
-        </w:rPr>
-      </w:pPr>
-    </w:p>
-    <w:p>
-      <w:pPr>
-        <w:pStyle w:val="NoSpacing"/>
-        <w:rPr>
-          <w:rFonts w:ascii="Calibri" w:hAnsi="Calibri" w:cs="Calibri"/>
-        </w:rPr>
-      </w:pPr>
-      <w:r>
-        <w:rPr>
-          <w:rFonts w:ascii="Calibri" w:hAnsi="Calibri" w:cs="Calibri"/>
-        </w:rPr>
-        <w:t>CREATE TABLE IF NOT EXISTS public.worldproduction</w:t>
-      </w:r>
+        <w:t xml:space="preserve">TABLESPACE </w:t>
+      </w:r>
+      <w:proofErr w:type="spellStart"/>
+      <w:r>
+        <w:rPr>
+          <w:rFonts w:ascii="Calibri" w:hAnsi="Calibri" w:cs="Calibri"/>
+        </w:rPr>
+        <w:t>pg_default</w:t>
+      </w:r>
+      <w:proofErr w:type="spellEnd"/>
+      <w:r>
+        <w:rPr>
+          <w:rFonts w:ascii="Calibri" w:hAnsi="Calibri" w:cs="Calibri"/>
+        </w:rPr>
+        <w:t>;</w:t>
+      </w:r>
+    </w:p>
+    <w:p>
+      <w:pPr>
+        <w:pStyle w:val="NoSpacing"/>
+        <w:rPr>
+          <w:rFonts w:ascii="Calibri" w:hAnsi="Calibri" w:cs="Calibri"/>
+        </w:rPr>
+      </w:pPr>
+    </w:p>
+    <w:p>
+      <w:pPr>
+        <w:pStyle w:val="NoSpacing"/>
+        <w:rPr>
+          <w:rFonts w:ascii="Calibri" w:hAnsi="Calibri" w:cs="Calibri"/>
+        </w:rPr>
+      </w:pPr>
+      <w:r>
+        <w:rPr>
+          <w:rFonts w:ascii="Calibri" w:hAnsi="Calibri" w:cs="Calibri"/>
+        </w:rPr>
+        <w:t xml:space="preserve">ALTER TABLE IF EXISTS </w:t>
+      </w:r>
+      <w:proofErr w:type="spellStart"/>
+      <w:r>
+        <w:rPr>
+          <w:rFonts w:ascii="Calibri" w:hAnsi="Calibri" w:cs="Calibri"/>
+        </w:rPr>
+        <w:t>public.worldconsumption</w:t>
+      </w:r>
+      <w:proofErr w:type="spellEnd"/>
+    </w:p>
+    <w:p>
+      <w:pPr>
+        <w:pStyle w:val="NoSpacing"/>
+        <w:rPr>
+          <w:rFonts w:ascii="Calibri" w:hAnsi="Calibri" w:cs="Calibri"/>
+        </w:rPr>
+      </w:pPr>
+      <w:r>
+        <w:rPr>
+          <w:rFonts w:ascii="Calibri" w:hAnsi="Calibri" w:cs="Calibri"/>
+        </w:rPr>
+        <w:t xml:space="preserve">    OWNER to </w:t>
+      </w:r>
+      <w:proofErr w:type="spellStart"/>
+      <w:r>
+        <w:rPr>
+          <w:rFonts w:ascii="Calibri" w:hAnsi="Calibri" w:cs="Calibri"/>
+        </w:rPr>
+        <w:t>postgres</w:t>
+      </w:r>
+      <w:proofErr w:type="spellEnd"/>
+      <w:r>
+        <w:rPr>
+          <w:rFonts w:ascii="Calibri" w:hAnsi="Calibri" w:cs="Calibri"/>
+        </w:rPr>
+        <w:t>;</w:t>
+      </w:r>
+    </w:p>
+    <w:p>
+      <w:pPr>
+        <w:pStyle w:val="NoSpacing"/>
+        <w:rPr>
+          <w:rFonts w:ascii="Calibri" w:hAnsi="Calibri" w:cs="Calibri"/>
+        </w:rPr>
+      </w:pPr>
+    </w:p>
+    <w:p>
+      <w:pPr>
+        <w:pStyle w:val="NoSpacing"/>
+        <w:rPr>
+          <w:rFonts w:ascii="Calibri" w:hAnsi="Calibri" w:cs="Calibri"/>
+        </w:rPr>
+      </w:pPr>
+      <w:r>
+        <w:rPr>
+          <w:rFonts w:ascii="Calibri" w:hAnsi="Calibri" w:cs="Calibri"/>
+        </w:rPr>
+        <w:t xml:space="preserve">-- Table: </w:t>
+      </w:r>
+      <w:proofErr w:type="spellStart"/>
+      <w:r>
+        <w:rPr>
+          <w:rFonts w:ascii="Calibri" w:hAnsi="Calibri" w:cs="Calibri"/>
+        </w:rPr>
+        <w:t>public.worldproduction</w:t>
+      </w:r>
+      <w:proofErr w:type="spellEnd"/>
+    </w:p>
+    <w:p>
+      <w:pPr>
+        <w:pStyle w:val="NoSpacing"/>
+        <w:rPr>
+          <w:rFonts w:ascii="Calibri" w:hAnsi="Calibri" w:cs="Calibri"/>
+        </w:rPr>
+      </w:pPr>
+    </w:p>
+    <w:p>
+      <w:pPr>
+        <w:pStyle w:val="NoSpacing"/>
+        <w:rPr>
+          <w:rFonts w:ascii="Calibri" w:hAnsi="Calibri" w:cs="Calibri"/>
+        </w:rPr>
+      </w:pPr>
+      <w:r>
+        <w:rPr>
+          <w:rFonts w:ascii="Calibri" w:hAnsi="Calibri" w:cs="Calibri"/>
+        </w:rPr>
+        <w:t xml:space="preserve">-- DROP TABLE IF EXISTS </w:t>
+      </w:r>
+      <w:proofErr w:type="spellStart"/>
+      <w:r>
+        <w:rPr>
+          <w:rFonts w:ascii="Calibri" w:hAnsi="Calibri" w:cs="Calibri"/>
+        </w:rPr>
+        <w:t>public.worldproduction</w:t>
+      </w:r>
+      <w:proofErr w:type="spellEnd"/>
+      <w:r>
+        <w:rPr>
+          <w:rFonts w:ascii="Calibri" w:hAnsi="Calibri" w:cs="Calibri"/>
+        </w:rPr>
+        <w:t>;</w:t>
+      </w:r>
+    </w:p>
+    <w:p>
+      <w:pPr>
+        <w:pStyle w:val="NoSpacing"/>
+        <w:rPr>
+          <w:rFonts w:ascii="Calibri" w:hAnsi="Calibri" w:cs="Calibri"/>
+        </w:rPr>
+      </w:pPr>
+    </w:p>
+    <w:p>
+      <w:pPr>
+        <w:pStyle w:val="NoSpacing"/>
+        <w:rPr>
+          <w:rFonts w:ascii="Calibri" w:hAnsi="Calibri" w:cs="Calibri"/>
+        </w:rPr>
+      </w:pPr>
+      <w:r>
+        <w:rPr>
+          <w:rFonts w:ascii="Calibri" w:hAnsi="Calibri" w:cs="Calibri"/>
+        </w:rPr>
+        <w:t xml:space="preserve">CREATE TABLE IF NOT EXISTS </w:t>
+      </w:r>
+      <w:proofErr w:type="spellStart"/>
+      <w:r>
+        <w:rPr>
+          <w:rFonts w:ascii="Calibri" w:hAnsi="Calibri" w:cs="Calibri"/>
+        </w:rPr>
+        <w:t>public.worldproduction</w:t>
+      </w:r>
+      <w:proofErr w:type="spellEnd"/>
     </w:p>
     <w:p>
       <w:pPr>
@@ -2080,35 +3003,77 @@
         <w:rPr>
           <w:rFonts w:ascii="Calibri" w:hAnsi="Calibri" w:cs="Calibri"/>
         </w:rPr>
-        <w:t xml:space="preserve">    "Continent" text COLLATE pg_catalog."default",</w:t>
-      </w:r>
-    </w:p>
-    <w:p>
-      <w:pPr>
-        <w:pStyle w:val="NoSpacing"/>
-        <w:rPr>
-          <w:rFonts w:ascii="Calibri" w:hAnsi="Calibri" w:cs="Calibri"/>
-        </w:rPr>
-      </w:pPr>
-      <w:r>
-        <w:rPr>
-          <w:rFonts w:ascii="Calibri" w:hAnsi="Calibri" w:cs="Calibri"/>
-        </w:rPr>
-        <w:t xml:space="preserve">    "Country" text COLLATE pg_catalog."default",</w:t>
-      </w:r>
-    </w:p>
-    <w:p>
-      <w:pPr>
-        <w:pStyle w:val="NoSpacing"/>
-        <w:rPr>
-          <w:rFonts w:ascii="Calibri" w:hAnsi="Calibri" w:cs="Calibri"/>
-        </w:rPr>
-      </w:pPr>
-      <w:r>
-        <w:rPr>
-          <w:rFonts w:ascii="Calibri" w:hAnsi="Calibri" w:cs="Calibri"/>
-        </w:rPr>
-        <w:t xml:space="preserve">    "Energy" text COLLATE pg_catalog."default",</w:t>
+        <w:t xml:space="preserve">    "Continent" text COLLATE </w:t>
+      </w:r>
+      <w:proofErr w:type="spellStart"/>
+      <w:r>
+        <w:rPr>
+          <w:rFonts w:ascii="Calibri" w:hAnsi="Calibri" w:cs="Calibri"/>
+        </w:rPr>
+        <w:t>pg_catalog."default</w:t>
+      </w:r>
+      <w:proofErr w:type="spellEnd"/>
+      <w:r>
+        <w:rPr>
+          <w:rFonts w:ascii="Calibri" w:hAnsi="Calibri" w:cs="Calibri"/>
+        </w:rPr>
+        <w:t>",</w:t>
+      </w:r>
+    </w:p>
+    <w:p>
+      <w:pPr>
+        <w:pStyle w:val="NoSpacing"/>
+        <w:rPr>
+          <w:rFonts w:ascii="Calibri" w:hAnsi="Calibri" w:cs="Calibri"/>
+        </w:rPr>
+      </w:pPr>
+      <w:r>
+        <w:rPr>
+          <w:rFonts w:ascii="Calibri" w:hAnsi="Calibri" w:cs="Calibri"/>
+        </w:rPr>
+        <w:t xml:space="preserve">    "Country" text COLLATE </w:t>
+      </w:r>
+      <w:proofErr w:type="spellStart"/>
+      <w:r>
+        <w:rPr>
+          <w:rFonts w:ascii="Calibri" w:hAnsi="Calibri" w:cs="Calibri"/>
+        </w:rPr>
+        <w:t>pg_catalog."default</w:t>
+      </w:r>
+      <w:proofErr w:type="spellEnd"/>
+      <w:r>
+        <w:rPr>
+          <w:rFonts w:ascii="Calibri" w:hAnsi="Calibri" w:cs="Calibri"/>
+        </w:rPr>
+        <w:t>",</w:t>
+      </w:r>
+    </w:p>
+    <w:p>
+      <w:pPr>
+        <w:pStyle w:val="NoSpacing"/>
+        <w:rPr>
+          <w:rFonts w:ascii="Calibri" w:hAnsi="Calibri" w:cs="Calibri"/>
+        </w:rPr>
+      </w:pPr>
+      <w:r>
+        <w:rPr>
+          <w:rFonts w:ascii="Calibri" w:hAnsi="Calibri" w:cs="Calibri"/>
+        </w:rPr>
+        <w:t xml:space="preserve">    "Energy" text COLLATE </w:t>
+      </w:r>
+      <w:proofErr w:type="spellStart"/>
+      <w:r>
+        <w:rPr>
+          <w:rFonts w:ascii="Calibri" w:hAnsi="Calibri" w:cs="Calibri"/>
+        </w:rPr>
+        <w:t>pg_catalog."default</w:t>
+      </w:r>
+      <w:proofErr w:type="spellEnd"/>
+      <w:r>
+        <w:rPr>
+          <w:rFonts w:ascii="Calibri" w:hAnsi="Calibri" w:cs="Calibri"/>
+        </w:rPr>
+        <w:t>",</w:t>
       </w:r>
     </w:p>
     <w:p>
@@ -2785,30 +3750,52 @@
         <w:rPr>
           <w:rFonts w:ascii="Calibri" w:hAnsi="Calibri" w:cs="Calibri"/>
         </w:rPr>
-        <w:t>TABLESPACE pg_default;</w:t>
-      </w:r>
-    </w:p>
-    <w:p>
-      <w:pPr>
-        <w:pStyle w:val="NoSpacing"/>
-        <w:rPr>
-          <w:rFonts w:ascii="Calibri" w:hAnsi="Calibri" w:cs="Calibri"/>
-        </w:rPr>
-      </w:pPr>
-    </w:p>
-    <w:p>
-      <w:pPr>
-        <w:pStyle w:val="NoSpacing"/>
-        <w:rPr>
-          <w:rFonts w:ascii="Calibri" w:hAnsi="Calibri" w:cs="Calibri"/>
-        </w:rPr>
-      </w:pPr>
-      <w:r>
-        <w:rPr>
-          <w:rFonts w:ascii="Calibri" w:hAnsi="Calibri" w:cs="Calibri"/>
-        </w:rPr>
-        <w:t>ALTER TABLE IF EXISTS public.worldproduction</w:t>
-      </w:r>
+        <w:t xml:space="preserve">TABLESPACE </w:t>
+      </w:r>
+      <w:proofErr w:type="spellStart"/>
+      <w:r>
+        <w:rPr>
+          <w:rFonts w:ascii="Calibri" w:hAnsi="Calibri" w:cs="Calibri"/>
+        </w:rPr>
+        <w:t>pg_default</w:t>
+      </w:r>
+      <w:proofErr w:type="spellEnd"/>
+      <w:r>
+        <w:rPr>
+          <w:rFonts w:ascii="Calibri" w:hAnsi="Calibri" w:cs="Calibri"/>
+        </w:rPr>
+        <w:t>;</w:t>
+      </w:r>
+    </w:p>
+    <w:p>
+      <w:pPr>
+        <w:pStyle w:val="NoSpacing"/>
+        <w:rPr>
+          <w:rFonts w:ascii="Calibri" w:hAnsi="Calibri" w:cs="Calibri"/>
+        </w:rPr>
+      </w:pPr>
+    </w:p>
+    <w:p>
+      <w:pPr>
+        <w:pStyle w:val="NoSpacing"/>
+        <w:rPr>
+          <w:rFonts w:ascii="Calibri" w:hAnsi="Calibri" w:cs="Calibri"/>
+        </w:rPr>
+      </w:pPr>
+      <w:r>
+        <w:rPr>
+          <w:rFonts w:ascii="Calibri" w:hAnsi="Calibri" w:cs="Calibri"/>
+        </w:rPr>
+        <w:t xml:space="preserve">ALTER TABLE IF EXISTS </w:t>
+      </w:r>
+      <w:proofErr w:type="spellStart"/>
+      <w:r>
+        <w:rPr>
+          <w:rFonts w:ascii="Calibri" w:hAnsi="Calibri" w:cs="Calibri"/>
+        </w:rPr>
+        <w:t>public.worldproduction</w:t>
+      </w:r>
+      <w:proofErr w:type="spellEnd"/>
     </w:p>
     <w:p>
       <w:pPr>
@@ -2822,7 +3809,393 @@
           <w:rFonts w:ascii="Calibri" w:hAnsi="Calibri" w:cs="Calibri"/>
         </w:rPr>
         <w:lastRenderedPageBreak/>
-        <w:t xml:space="preserve">    OWNER to postgres;</w:t>
+        <w:t xml:space="preserve">    OWNER to </w:t>
+      </w:r>
+      <w:proofErr w:type="spellStart"/>
+      <w:r>
+        <w:rPr>
+          <w:rFonts w:ascii="Calibri" w:hAnsi="Calibri" w:cs="Calibri"/>
+        </w:rPr>
+        <w:t>postgres</w:t>
+      </w:r>
+      <w:proofErr w:type="spellEnd"/>
+      <w:r>
+        <w:rPr>
+          <w:rFonts w:ascii="Calibri" w:hAnsi="Calibri" w:cs="Calibri"/>
+        </w:rPr>
+        <w:t>;</w:t>
+      </w:r>
+    </w:p>
+    <w:p>
+      <w:pPr>
+        <w:pStyle w:val="NoSpacing"/>
+        <w:rPr>
+          <w:rFonts w:ascii="Calibri" w:hAnsi="Calibri" w:cs="Calibri"/>
+        </w:rPr>
+      </w:pPr>
+    </w:p>
+    <w:p>
+      <w:pPr>
+        <w:pStyle w:val="NoSpacing"/>
+        <w:rPr>
+          <w:rFonts w:ascii="Calibri" w:hAnsi="Calibri" w:cs="Calibri"/>
+        </w:rPr>
+      </w:pPr>
+      <w:r>
+        <w:rPr>
+          <w:rFonts w:ascii="Calibri" w:hAnsi="Calibri" w:cs="Calibri"/>
+        </w:rPr>
+        <w:t xml:space="preserve">-- Table: </w:t>
+      </w:r>
+      <w:proofErr w:type="spellStart"/>
+      <w:r>
+        <w:rPr>
+          <w:rFonts w:ascii="Calibri" w:hAnsi="Calibri" w:cs="Calibri"/>
+        </w:rPr>
+        <w:t>public.allcountrysolarconsumption</w:t>
+      </w:r>
+      <w:proofErr w:type="spellEnd"/>
+    </w:p>
+    <w:p>
+      <w:pPr>
+        <w:pStyle w:val="NoSpacing"/>
+        <w:rPr>
+          <w:rFonts w:ascii="Calibri" w:hAnsi="Calibri" w:cs="Calibri"/>
+        </w:rPr>
+      </w:pPr>
+    </w:p>
+    <w:p>
+      <w:pPr>
+        <w:pStyle w:val="NoSpacing"/>
+        <w:rPr>
+          <w:rFonts w:ascii="Calibri" w:hAnsi="Calibri" w:cs="Calibri"/>
+        </w:rPr>
+      </w:pPr>
+      <w:r>
+        <w:rPr>
+          <w:rFonts w:ascii="Calibri" w:hAnsi="Calibri" w:cs="Calibri"/>
+        </w:rPr>
+        <w:t xml:space="preserve">-- DROP TABLE IF EXISTS </w:t>
+      </w:r>
+      <w:proofErr w:type="spellStart"/>
+      <w:r>
+        <w:rPr>
+          <w:rFonts w:ascii="Calibri" w:hAnsi="Calibri" w:cs="Calibri"/>
+        </w:rPr>
+        <w:t>public.allcountrysolarconsumption</w:t>
+      </w:r>
+      <w:proofErr w:type="spellEnd"/>
+      <w:r>
+        <w:rPr>
+          <w:rFonts w:ascii="Calibri" w:hAnsi="Calibri" w:cs="Calibri"/>
+        </w:rPr>
+        <w:t>;</w:t>
+      </w:r>
+    </w:p>
+    <w:p>
+      <w:pPr>
+        <w:pStyle w:val="NoSpacing"/>
+        <w:rPr>
+          <w:rFonts w:ascii="Calibri" w:hAnsi="Calibri" w:cs="Calibri"/>
+        </w:rPr>
+      </w:pPr>
+    </w:p>
+    <w:p>
+      <w:pPr>
+        <w:pStyle w:val="NoSpacing"/>
+        <w:rPr>
+          <w:rFonts w:ascii="Calibri" w:hAnsi="Calibri" w:cs="Calibri"/>
+        </w:rPr>
+      </w:pPr>
+      <w:r>
+        <w:rPr>
+          <w:rFonts w:ascii="Calibri" w:hAnsi="Calibri" w:cs="Calibri"/>
+        </w:rPr>
+        <w:t xml:space="preserve">CREATE TABLE IF NOT EXISTS </w:t>
+      </w:r>
+      <w:proofErr w:type="spellStart"/>
+      <w:r>
+        <w:rPr>
+          <w:rFonts w:ascii="Calibri" w:hAnsi="Calibri" w:cs="Calibri"/>
+        </w:rPr>
+        <w:t>public.allcountrysolarconsumption</w:t>
+      </w:r>
+      <w:proofErr w:type="spellEnd"/>
+    </w:p>
+    <w:p>
+      <w:pPr>
+        <w:pStyle w:val="NoSpacing"/>
+        <w:rPr>
+          <w:rFonts w:ascii="Calibri" w:hAnsi="Calibri" w:cs="Calibri"/>
+        </w:rPr>
+      </w:pPr>
+      <w:r>
+        <w:rPr>
+          <w:rFonts w:ascii="Calibri" w:hAnsi="Calibri" w:cs="Calibri"/>
+        </w:rPr>
+        <w:t>(</w:t>
+      </w:r>
+    </w:p>
+    <w:p>
+      <w:pPr>
+        <w:pStyle w:val="NoSpacing"/>
+        <w:rPr>
+          <w:rFonts w:ascii="Calibri" w:hAnsi="Calibri" w:cs="Calibri"/>
+        </w:rPr>
+      </w:pPr>
+      <w:r>
+        <w:rPr>
+          <w:rFonts w:ascii="Calibri" w:hAnsi="Calibri" w:cs="Calibri"/>
+        </w:rPr>
+        <w:t xml:space="preserve">    country text COLLATE </w:t>
+      </w:r>
+      <w:proofErr w:type="spellStart"/>
+      <w:r>
+        <w:rPr>
+          <w:rFonts w:ascii="Calibri" w:hAnsi="Calibri" w:cs="Calibri"/>
+        </w:rPr>
+        <w:t>pg_catalog."default</w:t>
+      </w:r>
+      <w:proofErr w:type="spellEnd"/>
+      <w:r>
+        <w:rPr>
+          <w:rFonts w:ascii="Calibri" w:hAnsi="Calibri" w:cs="Calibri"/>
+        </w:rPr>
+        <w:t>",</w:t>
+      </w:r>
+    </w:p>
+    <w:p>
+      <w:pPr>
+        <w:pStyle w:val="NoSpacing"/>
+        <w:rPr>
+          <w:rFonts w:ascii="Calibri" w:hAnsi="Calibri" w:cs="Calibri"/>
+        </w:rPr>
+      </w:pPr>
+      <w:r>
+        <w:rPr>
+          <w:rFonts w:ascii="Calibri" w:hAnsi="Calibri" w:cs="Calibri"/>
+        </w:rPr>
+        <w:t xml:space="preserve">    energy text COLLATE </w:t>
+      </w:r>
+      <w:proofErr w:type="spellStart"/>
+      <w:r>
+        <w:rPr>
+          <w:rFonts w:ascii="Calibri" w:hAnsi="Calibri" w:cs="Calibri"/>
+        </w:rPr>
+        <w:t>pg_catalog."default</w:t>
+      </w:r>
+      <w:proofErr w:type="spellEnd"/>
+      <w:r>
+        <w:rPr>
+          <w:rFonts w:ascii="Calibri" w:hAnsi="Calibri" w:cs="Calibri"/>
+        </w:rPr>
+        <w:t>",</w:t>
+      </w:r>
+    </w:p>
+    <w:p>
+      <w:pPr>
+        <w:pStyle w:val="NoSpacing"/>
+        <w:rPr>
+          <w:rFonts w:ascii="Calibri" w:hAnsi="Calibri" w:cs="Calibri"/>
+        </w:rPr>
+      </w:pPr>
+      <w:r>
+        <w:rPr>
+          <w:rFonts w:ascii="Calibri" w:hAnsi="Calibri" w:cs="Calibri"/>
+        </w:rPr>
+        <w:t xml:space="preserve">    year integer,</w:t>
+      </w:r>
+    </w:p>
+    <w:p>
+      <w:pPr>
+        <w:pStyle w:val="NoSpacing"/>
+        <w:rPr>
+          <w:rFonts w:ascii="Calibri" w:hAnsi="Calibri" w:cs="Calibri"/>
+        </w:rPr>
+      </w:pPr>
+      <w:r>
+        <w:rPr>
+          <w:rFonts w:ascii="Calibri" w:hAnsi="Calibri" w:cs="Calibri"/>
+        </w:rPr>
+        <w:t xml:space="preserve">    </w:t>
+      </w:r>
+      <w:proofErr w:type="spellStart"/>
+      <w:r>
+        <w:rPr>
+          <w:rFonts w:ascii="Calibri" w:hAnsi="Calibri" w:cs="Calibri"/>
+        </w:rPr>
+        <w:t>solar_electricity_generation_twh</w:t>
+      </w:r>
+      <w:proofErr w:type="spellEnd"/>
+      <w:r>
+        <w:rPr>
+          <w:rFonts w:ascii="Calibri" w:hAnsi="Calibri" w:cs="Calibri"/>
+        </w:rPr>
+        <w:t xml:space="preserve"> integer,</w:t>
+      </w:r>
+    </w:p>
+    <w:p>
+      <w:pPr>
+        <w:pStyle w:val="NoSpacing"/>
+        <w:rPr>
+          <w:rFonts w:ascii="Calibri" w:hAnsi="Calibri" w:cs="Calibri"/>
+        </w:rPr>
+      </w:pPr>
+      <w:r>
+        <w:rPr>
+          <w:rFonts w:ascii="Calibri" w:hAnsi="Calibri" w:cs="Calibri"/>
+        </w:rPr>
+        <w:t xml:space="preserve">    </w:t>
+      </w:r>
+      <w:proofErr w:type="spellStart"/>
+      <w:r>
+        <w:rPr>
+          <w:rFonts w:ascii="Calibri" w:hAnsi="Calibri" w:cs="Calibri"/>
+        </w:rPr>
+        <w:t>iso_code</w:t>
+      </w:r>
+      <w:proofErr w:type="spellEnd"/>
+      <w:r>
+        <w:rPr>
+          <w:rFonts w:ascii="Calibri" w:hAnsi="Calibri" w:cs="Calibri"/>
+        </w:rPr>
+        <w:t xml:space="preserve"> character varying(5) COLLATE </w:t>
+      </w:r>
+      <w:proofErr w:type="spellStart"/>
+      <w:r>
+        <w:rPr>
+          <w:rFonts w:ascii="Calibri" w:hAnsi="Calibri" w:cs="Calibri"/>
+        </w:rPr>
+        <w:t>pg_catalog."default</w:t>
+      </w:r>
+      <w:proofErr w:type="spellEnd"/>
+      <w:r>
+        <w:rPr>
+          <w:rFonts w:ascii="Calibri" w:hAnsi="Calibri" w:cs="Calibri"/>
+        </w:rPr>
+        <w:t>",</w:t>
+      </w:r>
+    </w:p>
+    <w:p>
+      <w:pPr>
+        <w:pStyle w:val="NoSpacing"/>
+        <w:rPr>
+          <w:rFonts w:ascii="Calibri" w:hAnsi="Calibri" w:cs="Calibri"/>
+        </w:rPr>
+      </w:pPr>
+      <w:r>
+        <w:rPr>
+          <w:rFonts w:ascii="Calibri" w:hAnsi="Calibri" w:cs="Calibri"/>
+        </w:rPr>
+        <w:t xml:space="preserve">    embedding vector(1536)</w:t>
+      </w:r>
+    </w:p>
+    <w:p>
+      <w:pPr>
+        <w:pStyle w:val="NoSpacing"/>
+        <w:rPr>
+          <w:rFonts w:ascii="Calibri" w:hAnsi="Calibri" w:cs="Calibri"/>
+        </w:rPr>
+      </w:pPr>
+      <w:r>
+        <w:rPr>
+          <w:rFonts w:ascii="Calibri" w:hAnsi="Calibri" w:cs="Calibri"/>
+        </w:rPr>
+        <w:t>)</w:t>
+      </w:r>
+    </w:p>
+    <w:p>
+      <w:pPr>
+        <w:pStyle w:val="NoSpacing"/>
+        <w:rPr>
+          <w:rFonts w:ascii="Calibri" w:hAnsi="Calibri" w:cs="Calibri"/>
+        </w:rPr>
+      </w:pPr>
+    </w:p>
+    <w:p>
+      <w:pPr>
+        <w:pStyle w:val="NoSpacing"/>
+        <w:rPr>
+          <w:rFonts w:ascii="Calibri" w:hAnsi="Calibri" w:cs="Calibri"/>
+        </w:rPr>
+      </w:pPr>
+      <w:r>
+        <w:rPr>
+          <w:rFonts w:ascii="Calibri" w:hAnsi="Calibri" w:cs="Calibri"/>
+        </w:rPr>
+        <w:t xml:space="preserve">TABLESPACE </w:t>
+      </w:r>
+      <w:proofErr w:type="spellStart"/>
+      <w:r>
+        <w:rPr>
+          <w:rFonts w:ascii="Calibri" w:hAnsi="Calibri" w:cs="Calibri"/>
+        </w:rPr>
+        <w:t>pg_default</w:t>
+      </w:r>
+      <w:proofErr w:type="spellEnd"/>
+      <w:r>
+        <w:rPr>
+          <w:rFonts w:ascii="Calibri" w:hAnsi="Calibri" w:cs="Calibri"/>
+        </w:rPr>
+        <w:t>;</w:t>
+      </w:r>
+    </w:p>
+    <w:p>
+      <w:pPr>
+        <w:pStyle w:val="NoSpacing"/>
+        <w:rPr>
+          <w:rFonts w:ascii="Calibri" w:hAnsi="Calibri" w:cs="Calibri"/>
+        </w:rPr>
+      </w:pPr>
+    </w:p>
+    <w:p>
+      <w:pPr>
+        <w:pStyle w:val="NoSpacing"/>
+        <w:rPr>
+          <w:rFonts w:ascii="Calibri" w:hAnsi="Calibri" w:cs="Calibri"/>
+        </w:rPr>
+      </w:pPr>
+      <w:r>
+        <w:rPr>
+          <w:rFonts w:ascii="Calibri" w:hAnsi="Calibri" w:cs="Calibri"/>
+        </w:rPr>
+        <w:t xml:space="preserve">ALTER TABLE IF EXISTS </w:t>
+      </w:r>
+      <w:proofErr w:type="spellStart"/>
+      <w:r>
+        <w:rPr>
+          <w:rFonts w:ascii="Calibri" w:hAnsi="Calibri" w:cs="Calibri"/>
+        </w:rPr>
+        <w:t>public.allcountrysolarconsumption</w:t>
+      </w:r>
+      <w:proofErr w:type="spellEnd"/>
+    </w:p>
+    <w:p>
+      <w:pPr>
+        <w:pStyle w:val="NoSpacing"/>
+        <w:rPr>
+          <w:rFonts w:ascii="Calibri" w:hAnsi="Calibri" w:cs="Calibri"/>
+        </w:rPr>
+      </w:pPr>
+      <w:r>
+        <w:rPr>
+          <w:rFonts w:ascii="Calibri" w:hAnsi="Calibri" w:cs="Calibri"/>
+        </w:rPr>
+        <w:t xml:space="preserve">    OWNER to </w:t>
+      </w:r>
+      <w:proofErr w:type="spellStart"/>
+      <w:r>
+        <w:rPr>
+          <w:rFonts w:ascii="Calibri" w:hAnsi="Calibri" w:cs="Calibri"/>
+        </w:rPr>
+        <w:t>postgres</w:t>
+      </w:r>
+      <w:proofErr w:type="spellEnd"/>
+      <w:r>
+        <w:rPr>
+          <w:rFonts w:ascii="Calibri" w:hAnsi="Calibri" w:cs="Calibri"/>
+        </w:rPr>
+        <w:t>;</w:t>
       </w:r>
     </w:p>
     <w:sectPr>

</xml_diff>